<commit_message>
Fix app integration and setup
</commit_message>
<xml_diff>
--- a/docs/Dokumentacja.docx
+++ b/docs/Dokumentacja.docx
@@ -4,6 +4,7 @@
   <w:body>
     <w:p>
       <w:pPr>
+        <w:jc w:val="center"/>
         <w:rPr>
           <w:rFonts w:ascii="Times New Roman" w:hAnsi="Times New Roman" w:cs="Times New Roman"/>
           <w:b/>
@@ -12,7 +13,6 @@
           <w:szCs w:val="24"/>
         </w:rPr>
       </w:pPr>
-      <w:proofErr w:type="spellStart"/>
       <w:r>
         <w:rPr>
           <w:rFonts w:ascii="Times New Roman" w:hAnsi="Times New Roman" w:cs="Times New Roman"/>
@@ -21,10 +21,11 @@
           <w:sz w:val="24"/>
           <w:szCs w:val="24"/>
         </w:rPr>
-        <w:t>CreditCheck</w:t>
-      </w:r>
-      <w:proofErr w:type="spellEnd"/>
-      <w:r>
+        <w:t>CreditCheck – dokumentacja projektu</w:t>
+      </w:r>
+    </w:p>
+    <w:p>
+      <w:pPr>
         <w:rPr>
           <w:rFonts w:ascii="Times New Roman" w:hAnsi="Times New Roman" w:cs="Times New Roman"/>
           <w:b/>
@@ -32,11 +33,8 @@
           <w:sz w:val="24"/>
           <w:szCs w:val="24"/>
         </w:rPr>
-        <w:t xml:space="preserve"> – dokumentacja projektu</w:t>
-      </w:r>
-    </w:p>
-    <w:p>
-      <w:pPr>
+      </w:pPr>
+      <w:r>
         <w:rPr>
           <w:rFonts w:ascii="Times New Roman" w:hAnsi="Times New Roman" w:cs="Times New Roman"/>
           <w:b/>
@@ -44,8 +42,92 @@
           <w:sz w:val="24"/>
           <w:szCs w:val="24"/>
         </w:rPr>
-      </w:pPr>
-      <w:r>
+        <w:t>Opis aplikacji</w:t>
+      </w:r>
+    </w:p>
+    <w:p>
+      <w:pPr>
+        <w:rPr>
+          <w:rFonts w:ascii="Times New Roman" w:hAnsi="Times New Roman" w:cs="Times New Roman"/>
+          <w:sz w:val="24"/>
+          <w:szCs w:val="24"/>
+        </w:rPr>
+      </w:pPr>
+      <w:r>
+        <w:rPr>
+          <w:rFonts w:ascii="Times New Roman" w:hAnsi="Times New Roman" w:cs="Times New Roman"/>
+          <w:sz w:val="24"/>
+          <w:szCs w:val="24"/>
+        </w:rPr>
+        <w:t>CreditCheck to lokalna aplikacja webowa wspierająca wstępną ocenę szans na</w:t>
+      </w:r>
+      <w:r>
+        <w:rPr>
+          <w:rFonts w:ascii="Times New Roman" w:hAnsi="Times New Roman" w:cs="Times New Roman"/>
+          <w:sz w:val="24"/>
+          <w:szCs w:val="24"/>
+        </w:rPr>
+        <w:t xml:space="preserve"> </w:t>
+      </w:r>
+      <w:r>
+        <w:rPr>
+          <w:rFonts w:ascii="Times New Roman" w:hAnsi="Times New Roman" w:cs="Times New Roman"/>
+          <w:sz w:val="24"/>
+          <w:szCs w:val="24"/>
+        </w:rPr>
+        <w:t>uzyskanie</w:t>
+      </w:r>
+      <w:r>
+        <w:rPr>
+          <w:rFonts w:ascii="Times New Roman" w:hAnsi="Times New Roman" w:cs="Times New Roman"/>
+          <w:sz w:val="24"/>
+          <w:szCs w:val="24"/>
+        </w:rPr>
+        <w:t xml:space="preserve"> </w:t>
+      </w:r>
+      <w:r>
+        <w:rPr>
+          <w:rFonts w:ascii="Times New Roman" w:hAnsi="Times New Roman" w:cs="Times New Roman"/>
+          <w:sz w:val="24"/>
+          <w:szCs w:val="24"/>
+        </w:rPr>
+        <w:t>kredytu. Użytkownik uzupełnia formularz, a aplikacja przedstawia</w:t>
+      </w:r>
+      <w:r>
+        <w:rPr>
+          <w:rFonts w:ascii="Times New Roman" w:hAnsi="Times New Roman" w:cs="Times New Roman"/>
+          <w:sz w:val="24"/>
+          <w:szCs w:val="24"/>
+        </w:rPr>
+        <w:t xml:space="preserve"> </w:t>
+      </w:r>
+      <w:r>
+        <w:rPr>
+          <w:rFonts w:ascii="Times New Roman" w:hAnsi="Times New Roman" w:cs="Times New Roman"/>
+          <w:sz w:val="24"/>
+          <w:szCs w:val="24"/>
+        </w:rPr>
+        <w:t>przewidywaną decyzję modelu, prawdopodobieństwo akceptacji oraz komentarz do</w:t>
+      </w:r>
+      <w:r>
+        <w:rPr>
+          <w:rFonts w:ascii="Times New Roman" w:hAnsi="Times New Roman" w:cs="Times New Roman"/>
+          <w:sz w:val="24"/>
+          <w:szCs w:val="24"/>
+        </w:rPr>
+        <w:t xml:space="preserve"> </w:t>
+      </w:r>
+      <w:r>
+        <w:rPr>
+          <w:rFonts w:ascii="Times New Roman" w:hAnsi="Times New Roman" w:cs="Times New Roman"/>
+          <w:sz w:val="24"/>
+          <w:szCs w:val="24"/>
+        </w:rPr>
+        <w:t>podanych danych.</w:t>
+      </w:r>
+    </w:p>
+    <w:p>
+      <w:pPr>
         <w:rPr>
           <w:rFonts w:ascii="Times New Roman" w:hAnsi="Times New Roman" w:cs="Times New Roman"/>
           <w:b/>
@@ -53,38 +135,57 @@
           <w:sz w:val="24"/>
           <w:szCs w:val="24"/>
         </w:rPr>
-        <w:t>Opis aplikacji</w:t>
-      </w:r>
-    </w:p>
-    <w:p>
-      <w:pPr>
-        <w:rPr>
-          <w:rFonts w:ascii="Times New Roman" w:hAnsi="Times New Roman" w:cs="Times New Roman"/>
-          <w:sz w:val="24"/>
-          <w:szCs w:val="24"/>
-        </w:rPr>
-      </w:pPr>
-      <w:r>
-        <w:rPr>
-          <w:rFonts w:ascii="Times New Roman" w:hAnsi="Times New Roman" w:cs="Times New Roman"/>
-          <w:sz w:val="24"/>
-          <w:szCs w:val="24"/>
-        </w:rPr>
-        <w:t>Aplikacja służy do przewidywania decyzji kredytowej na podstawie danych wprowadzonych przez użytkownika.</w:t>
-      </w:r>
-    </w:p>
-    <w:p>
-      <w:pPr>
+      </w:pPr>
+      <w:r>
         <w:rPr>
           <w:rFonts w:ascii="Times New Roman" w:hAnsi="Times New Roman" w:cs="Times New Roman"/>
           <w:b/>
           <w:bCs/>
           <w:sz w:val="24"/>
           <w:szCs w:val="24"/>
+        </w:rPr>
+        <w:t>Dataset</w:t>
+      </w:r>
+    </w:p>
+    <w:p>
+      <w:pPr>
+        <w:rPr>
+          <w:rFonts w:ascii="Times New Roman" w:hAnsi="Times New Roman" w:cs="Times New Roman"/>
+          <w:sz w:val="24"/>
+          <w:szCs w:val="24"/>
           <w:lang w:val="en-US"/>
         </w:rPr>
       </w:pPr>
       <w:r>
+        <w:rPr>
+          <w:rFonts w:ascii="Times New Roman" w:hAnsi="Times New Roman" w:cs="Times New Roman"/>
+          <w:sz w:val="24"/>
+          <w:szCs w:val="24"/>
+          <w:lang w:val="en-US"/>
+        </w:rPr>
+        <w:t>Loan Prediction Dataset (Kaggle)</w:t>
+      </w:r>
+      <w:r>
+        <w:rPr>
+          <w:rFonts w:ascii="Times New Roman" w:hAnsi="Times New Roman" w:cs="Times New Roman"/>
+          <w:sz w:val="24"/>
+          <w:szCs w:val="24"/>
+          <w:lang w:val="en-US"/>
+        </w:rPr>
+        <w:br/>
+      </w:r>
+      <w:r>
+        <w:rPr>
+          <w:rFonts w:ascii="Times New Roman" w:hAnsi="Times New Roman" w:cs="Times New Roman"/>
+          <w:sz w:val="24"/>
+          <w:szCs w:val="24"/>
+          <w:lang w:val="en-US"/>
+        </w:rPr>
+        <w:t>do uzupelnieina</w:t>
+      </w:r>
+    </w:p>
+    <w:p>
+      <w:pPr>
         <w:rPr>
           <w:rFonts w:ascii="Times New Roman" w:hAnsi="Times New Roman" w:cs="Times New Roman"/>
           <w:b/>
@@ -93,36 +194,59 @@
           <w:szCs w:val="24"/>
           <w:lang w:val="en-US"/>
         </w:rPr>
-        <w:t>Dataset</w:t>
-      </w:r>
-    </w:p>
-    <w:p>
-      <w:pPr>
-        <w:rPr>
-          <w:rFonts w:ascii="Times New Roman" w:hAnsi="Times New Roman" w:cs="Times New Roman"/>
-          <w:sz w:val="24"/>
-          <w:szCs w:val="24"/>
-          <w:lang w:val="en-US"/>
-        </w:rPr>
-      </w:pPr>
-      <w:r>
-        <w:rPr>
-          <w:rFonts w:ascii="Times New Roman" w:hAnsi="Times New Roman" w:cs="Times New Roman"/>
-          <w:sz w:val="24"/>
-          <w:szCs w:val="24"/>
-          <w:lang w:val="en-US"/>
-        </w:rPr>
-        <w:t>Loan Prediction Dataset (Kaggle)</w:t>
-      </w:r>
-    </w:p>
-    <w:p>
-      <w:pPr>
+      </w:pPr>
+      <w:r>
         <w:rPr>
           <w:rFonts w:ascii="Times New Roman" w:hAnsi="Times New Roman" w:cs="Times New Roman"/>
           <w:b/>
           <w:bCs/>
           <w:sz w:val="24"/>
           <w:szCs w:val="24"/>
+          <w:lang w:val="en-US"/>
+        </w:rPr>
+        <w:t>Model</w:t>
+      </w:r>
+    </w:p>
+    <w:p>
+      <w:pPr>
+        <w:rPr>
+          <w:rFonts w:ascii="Times New Roman" w:hAnsi="Times New Roman" w:cs="Times New Roman"/>
+          <w:sz w:val="24"/>
+          <w:szCs w:val="24"/>
+        </w:rPr>
+      </w:pPr>
+      <w:r>
+        <w:rPr>
+          <w:rFonts w:ascii="Times New Roman" w:hAnsi="Times New Roman" w:cs="Times New Roman"/>
+          <w:sz w:val="24"/>
+          <w:szCs w:val="24"/>
+        </w:rPr>
+        <w:t>Do uzupełnienia po wytrenowaniu modelu.</w:t>
+      </w:r>
+    </w:p>
+    <w:p>
+      <w:pPr>
+        <w:rPr>
+          <w:rFonts w:ascii="Times New Roman" w:hAnsi="Times New Roman" w:cs="Times New Roman"/>
+          <w:sz w:val="24"/>
+          <w:szCs w:val="24"/>
+        </w:rPr>
+      </w:pPr>
+      <w:r>
+        <w:rPr>
+          <w:rFonts w:ascii="Times New Roman" w:hAnsi="Times New Roman" w:cs="Times New Roman"/>
+          <w:sz w:val="24"/>
+          <w:szCs w:val="24"/>
+        </w:rPr>
+        <w:t>+wektor wejściowy/wyjściowy</w:t>
+      </w:r>
+    </w:p>
+    <w:p>
+      <w:pPr>
+        <w:rPr>
+          <w:rFonts w:ascii="Times New Roman" w:hAnsi="Times New Roman" w:cs="Times New Roman"/>
+          <w:sz w:val="24"/>
+          <w:szCs w:val="24"/>
         </w:rPr>
       </w:pPr>
       <w:r>
@@ -133,28 +257,210 @@
           <w:sz w:val="24"/>
           <w:szCs w:val="24"/>
         </w:rPr>
-        <w:t>Model</w:t>
-      </w:r>
-    </w:p>
-    <w:p>
-      <w:pPr>
-        <w:rPr>
-          <w:rFonts w:ascii="Times New Roman" w:hAnsi="Times New Roman" w:cs="Times New Roman"/>
-          <w:sz w:val="24"/>
-          <w:szCs w:val="24"/>
-        </w:rPr>
-      </w:pPr>
-      <w:r>
-        <w:rPr>
-          <w:rFonts w:ascii="Times New Roman" w:hAnsi="Times New Roman" w:cs="Times New Roman"/>
-          <w:sz w:val="24"/>
-          <w:szCs w:val="24"/>
-        </w:rPr>
-        <w:t>Do uzupełnienia po wytrenowaniu modelu.</w:t>
-      </w:r>
-    </w:p>
-    <w:p>
-      <w:pPr>
+        <w:t>Uruchomienie</w:t>
+      </w:r>
+    </w:p>
+    <w:p>
+      <w:pPr>
+        <w:pStyle w:val="ListParagraph"/>
+        <w:numPr>
+          <w:ilvl w:val="0"/>
+          <w:numId w:val="4"/>
+        </w:numPr>
+        <w:rPr>
+          <w:rFonts w:ascii="Times New Roman" w:hAnsi="Times New Roman" w:cs="Times New Roman"/>
+          <w:sz w:val="24"/>
+          <w:szCs w:val="24"/>
+        </w:rPr>
+      </w:pPr>
+      <w:r>
+        <w:rPr>
+          <w:rFonts w:ascii="Times New Roman" w:hAnsi="Times New Roman" w:cs="Times New Roman"/>
+          <w:sz w:val="24"/>
+          <w:szCs w:val="24"/>
+        </w:rPr>
+        <w:t>Pobierz lub sklonuj repozytorium.</w:t>
+      </w:r>
+    </w:p>
+    <w:p>
+      <w:pPr>
+        <w:pStyle w:val="ListParagraph"/>
+        <w:numPr>
+          <w:ilvl w:val="0"/>
+          <w:numId w:val="4"/>
+        </w:numPr>
+        <w:rPr>
+          <w:rFonts w:ascii="Times New Roman" w:hAnsi="Times New Roman" w:cs="Times New Roman"/>
+          <w:sz w:val="24"/>
+          <w:szCs w:val="24"/>
+        </w:rPr>
+      </w:pPr>
+      <w:r>
+        <w:rPr>
+          <w:rFonts w:ascii="Times New Roman" w:hAnsi="Times New Roman" w:cs="Times New Roman"/>
+          <w:sz w:val="24"/>
+          <w:szCs w:val="24"/>
+        </w:rPr>
+        <w:t>Uruchom plik `run.bat`.</w:t>
+      </w:r>
+    </w:p>
+    <w:p>
+      <w:pPr>
+        <w:pStyle w:val="ListParagraph"/>
+        <w:numPr>
+          <w:ilvl w:val="0"/>
+          <w:numId w:val="4"/>
+        </w:numPr>
+        <w:rPr>
+          <w:rFonts w:ascii="Times New Roman" w:hAnsi="Times New Roman" w:cs="Times New Roman"/>
+          <w:sz w:val="24"/>
+          <w:szCs w:val="24"/>
+        </w:rPr>
+      </w:pPr>
+      <w:r>
+        <w:rPr>
+          <w:rFonts w:ascii="Times New Roman" w:hAnsi="Times New Roman" w:cs="Times New Roman"/>
+          <w:sz w:val="24"/>
+          <w:szCs w:val="24"/>
+        </w:rPr>
+        <w:t>Przy pierwszym uruchomieniu skrypt:</w:t>
+      </w:r>
+    </w:p>
+    <w:p>
+      <w:pPr>
+        <w:pStyle w:val="ListParagraph"/>
+        <w:rPr>
+          <w:rFonts w:ascii="Times New Roman" w:hAnsi="Times New Roman" w:cs="Times New Roman"/>
+          <w:sz w:val="24"/>
+          <w:szCs w:val="24"/>
+        </w:rPr>
+      </w:pPr>
+      <w:r>
+        <w:rPr>
+          <w:rFonts w:ascii="Times New Roman" w:hAnsi="Times New Roman" w:cs="Times New Roman"/>
+          <w:sz w:val="24"/>
+          <w:szCs w:val="24"/>
+        </w:rPr>
+        <w:t xml:space="preserve">- </w:t>
+      </w:r>
+      <w:r>
+        <w:rPr>
+          <w:rFonts w:ascii="Times New Roman" w:hAnsi="Times New Roman" w:cs="Times New Roman"/>
+          <w:sz w:val="24"/>
+          <w:szCs w:val="24"/>
+        </w:rPr>
+        <w:t>sprawdzi wersję Pythona,</w:t>
+      </w:r>
+    </w:p>
+    <w:p>
+      <w:pPr>
+        <w:pStyle w:val="ListParagraph"/>
+        <w:rPr>
+          <w:rFonts w:ascii="Times New Roman" w:hAnsi="Times New Roman" w:cs="Times New Roman"/>
+          <w:sz w:val="24"/>
+          <w:szCs w:val="24"/>
+        </w:rPr>
+      </w:pPr>
+      <w:r>
+        <w:rPr>
+          <w:rFonts w:ascii="Times New Roman" w:hAnsi="Times New Roman" w:cs="Times New Roman"/>
+          <w:sz w:val="24"/>
+          <w:szCs w:val="24"/>
+        </w:rPr>
+        <w:t>- utworzy lokalne środowisko `.venv`,</w:t>
+      </w:r>
+    </w:p>
+    <w:p>
+      <w:pPr>
+        <w:pStyle w:val="ListParagraph"/>
+        <w:rPr>
+          <w:rFonts w:ascii="Times New Roman" w:hAnsi="Times New Roman" w:cs="Times New Roman"/>
+          <w:sz w:val="24"/>
+          <w:szCs w:val="24"/>
+        </w:rPr>
+      </w:pPr>
+      <w:r>
+        <w:rPr>
+          <w:rFonts w:ascii="Times New Roman" w:hAnsi="Times New Roman" w:cs="Times New Roman"/>
+          <w:sz w:val="24"/>
+          <w:szCs w:val="24"/>
+        </w:rPr>
+        <w:t>- zainstaluje wersje bibliotek z `requirements.txt`,</w:t>
+      </w:r>
+    </w:p>
+    <w:p>
+      <w:pPr>
+        <w:pStyle w:val="ListParagraph"/>
+        <w:rPr>
+          <w:rFonts w:ascii="Times New Roman" w:hAnsi="Times New Roman" w:cs="Times New Roman"/>
+          <w:sz w:val="24"/>
+          <w:szCs w:val="24"/>
+        </w:rPr>
+      </w:pPr>
+      <w:r>
+        <w:rPr>
+          <w:rFonts w:ascii="Times New Roman" w:hAnsi="Times New Roman" w:cs="Times New Roman"/>
+          <w:sz w:val="24"/>
+          <w:szCs w:val="24"/>
+        </w:rPr>
+        <w:t xml:space="preserve">- uruchomi aplikację </w:t>
+      </w:r>
+      <w:r>
+        <w:rPr>
+          <w:rFonts w:ascii="Times New Roman" w:hAnsi="Times New Roman" w:cs="Times New Roman"/>
+          <w:sz w:val="24"/>
+          <w:szCs w:val="24"/>
+        </w:rPr>
+        <w:t xml:space="preserve">w przeglądarce </w:t>
+      </w:r>
+    </w:p>
+    <w:p>
+      <w:pPr>
+        <w:pStyle w:val="ListParagraph"/>
+        <w:numPr>
+          <w:ilvl w:val="0"/>
+          <w:numId w:val="4"/>
+        </w:numPr>
+        <w:rPr>
+          <w:rFonts w:ascii="Times New Roman" w:hAnsi="Times New Roman" w:cs="Times New Roman"/>
+          <w:sz w:val="24"/>
+          <w:szCs w:val="24"/>
+        </w:rPr>
+      </w:pPr>
+      <w:r>
+        <w:rPr>
+          <w:rFonts w:ascii="Times New Roman" w:hAnsi="Times New Roman" w:cs="Times New Roman"/>
+          <w:sz w:val="24"/>
+          <w:szCs w:val="24"/>
+        </w:rPr>
+        <w:t>Aplikacja otworzy się w przeglądarce pod adresem</w:t>
+      </w:r>
+      <w:r>
+        <w:rPr>
+          <w:rFonts w:ascii="Times New Roman" w:hAnsi="Times New Roman" w:cs="Times New Roman"/>
+          <w:sz w:val="24"/>
+          <w:szCs w:val="24"/>
+        </w:rPr>
+        <w:t xml:space="preserve"> </w:t>
+      </w:r>
+      <w:r>
+        <w:rPr>
+          <w:rFonts w:ascii="Times New Roman" w:hAnsi="Times New Roman" w:cs="Times New Roman"/>
+          <w:sz w:val="24"/>
+          <w:szCs w:val="24"/>
+        </w:rPr>
+        <w:t>`http://localhost:8501`.</w:t>
+      </w:r>
+    </w:p>
+    <w:p>
+      <w:pPr>
+        <w:rPr>
+          <w:rFonts w:ascii="Times New Roman" w:hAnsi="Times New Roman" w:cs="Times New Roman"/>
+          <w:sz w:val="24"/>
+          <w:szCs w:val="24"/>
+        </w:rPr>
+      </w:pPr>
+      <w:r>
         <w:rPr>
           <w:rFonts w:ascii="Times New Roman" w:hAnsi="Times New Roman" w:cs="Times New Roman"/>
           <w:b/>
@@ -162,6 +468,74 @@
           <w:sz w:val="24"/>
           <w:szCs w:val="24"/>
         </w:rPr>
+        <w:t>Interfejs</w:t>
+      </w:r>
+      <w:r>
+        <w:rPr>
+          <w:rFonts w:ascii="Times New Roman" w:hAnsi="Times New Roman" w:cs="Times New Roman"/>
+          <w:sz w:val="24"/>
+          <w:szCs w:val="24"/>
+        </w:rPr>
+        <w:br/>
+      </w:r>
+      <w:r>
+        <w:rPr>
+          <w:rFonts w:ascii="Times New Roman" w:hAnsi="Times New Roman" w:cs="Times New Roman"/>
+          <w:sz w:val="24"/>
+          <w:szCs w:val="24"/>
+        </w:rPr>
+        <w:br/>
+      </w:r>
+      <w:r>
+        <w:rPr>
+          <w:rFonts w:ascii="Times New Roman" w:hAnsi="Times New Roman" w:cs="Times New Roman"/>
+          <w:sz w:val="24"/>
+          <w:szCs w:val="24"/>
+        </w:rPr>
+        <w:t>Aplikacja została przygotowana jako lokalna aplikacja internetowa z wykorzystaniem biblioteki Streamlit. Interfejs składa się z formularza podzielonego na sekcję danych wnioskodawcy oraz sekcję danych kredytu.</w:t>
+      </w:r>
+    </w:p>
+    <w:p>
+      <w:pPr>
+        <w:rPr>
+          <w:rFonts w:ascii="Times New Roman" w:hAnsi="Times New Roman" w:cs="Times New Roman"/>
+          <w:sz w:val="24"/>
+          <w:szCs w:val="24"/>
+        </w:rPr>
+      </w:pPr>
+      <w:r>
+        <w:rPr>
+          <w:rFonts w:ascii="Times New Roman" w:hAnsi="Times New Roman" w:cs="Times New Roman"/>
+          <w:sz w:val="24"/>
+          <w:szCs w:val="24"/>
+        </w:rPr>
+        <w:t>Użytkownik podaje między innymi płeć, stan cywilny, dochód, liczbę osób na utrzymaniu, formę zatrudnienia, obecność i dochód współwnioskodawcy, kwotę kredytu, okres kredytowania, historię spłaty zobowiązań oraz lokalizację nieruchomości.</w:t>
+      </w:r>
+    </w:p>
+    <w:p>
+      <w:pPr>
+        <w:rPr>
+          <w:rFonts w:ascii="Times New Roman" w:hAnsi="Times New Roman" w:cs="Times New Roman"/>
+          <w:sz w:val="24"/>
+          <w:szCs w:val="24"/>
+        </w:rPr>
+      </w:pPr>
+      <w:r>
+        <w:rPr>
+          <w:rFonts w:ascii="Times New Roman" w:hAnsi="Times New Roman" w:cs="Times New Roman"/>
+          <w:sz w:val="24"/>
+          <w:szCs w:val="24"/>
+        </w:rPr>
+        <w:t>Po wybraniu przycisku „Sprawdź decyzję kredytową” aplikacja przekazuje przygotowane dane do modelu. Następnie prezentuje przewidywaną decyzję, prawdopodobieństwo akceptacji oraz komentarze dotyczące podanych informacji.</w:t>
+      </w:r>
+    </w:p>
+    <w:p>
+      <w:pPr>
+        <w:rPr>
+          <w:rFonts w:ascii="Times New Roman" w:hAnsi="Times New Roman" w:cs="Times New Roman"/>
+          <w:sz w:val="24"/>
+          <w:szCs w:val="24"/>
+        </w:rPr>
       </w:pPr>
       <w:r>
         <w:rPr>
@@ -171,138 +545,200 @@
           <w:sz w:val="24"/>
           <w:szCs w:val="24"/>
         </w:rPr>
-        <w:t>Wektor wejściowy</w:t>
-      </w:r>
-    </w:p>
-    <w:p>
-      <w:pPr>
+        <w:t>System testowy</w:t>
+      </w:r>
+      <w:r>
+        <w:rPr>
+          <w:rFonts w:ascii="Times New Roman" w:hAnsi="Times New Roman" w:cs="Times New Roman"/>
+          <w:b/>
+          <w:bCs/>
+          <w:sz w:val="24"/>
+          <w:szCs w:val="24"/>
+        </w:rPr>
+        <w:br/>
+      </w:r>
+      <w:r>
+        <w:rPr>
+          <w:rFonts w:ascii="Times New Roman" w:hAnsi="Times New Roman" w:cs="Times New Roman"/>
+          <w:sz w:val="24"/>
+          <w:szCs w:val="24"/>
+        </w:rPr>
+        <w:t>Aplikację przetestowano lokalnie na:</w:t>
+      </w:r>
+    </w:p>
+    <w:p>
+      <w:pPr>
+        <w:pStyle w:val="ListParagraph"/>
         <w:numPr>
           <w:ilvl w:val="0"/>
-          <w:numId w:val="1"/>
+          <w:numId w:val="5"/>
         </w:numPr>
         <w:rPr>
           <w:rFonts w:ascii="Times New Roman" w:hAnsi="Times New Roman" w:cs="Times New Roman"/>
           <w:sz w:val="24"/>
           <w:szCs w:val="24"/>
-        </w:rPr>
-      </w:pPr>
-      <w:proofErr w:type="spellStart"/>
-      <w:r>
-        <w:rPr>
-          <w:rFonts w:ascii="Times New Roman" w:hAnsi="Times New Roman" w:cs="Times New Roman"/>
-          <w:sz w:val="24"/>
-          <w:szCs w:val="24"/>
-        </w:rPr>
-        <w:t>Gender</w:t>
-      </w:r>
-      <w:proofErr w:type="spellEnd"/>
-      <w:r>
-        <w:rPr>
-          <w:rFonts w:ascii="Times New Roman" w:hAnsi="Times New Roman" w:cs="Times New Roman"/>
-          <w:sz w:val="24"/>
-          <w:szCs w:val="24"/>
-        </w:rPr>
-        <w:t xml:space="preserve"> </w:t>
-      </w:r>
-    </w:p>
-    <w:p>
-      <w:pPr>
+          <w:lang w:val="en-US"/>
+        </w:rPr>
+      </w:pPr>
+      <w:r>
+        <w:rPr>
+          <w:rFonts w:ascii="Times New Roman" w:hAnsi="Times New Roman" w:cs="Times New Roman"/>
+          <w:sz w:val="24"/>
+          <w:szCs w:val="24"/>
+          <w:lang w:val="en-US"/>
+        </w:rPr>
+        <w:t>Windows 11,</w:t>
+      </w:r>
+    </w:p>
+    <w:p>
+      <w:pPr>
+        <w:pStyle w:val="ListParagraph"/>
         <w:numPr>
           <w:ilvl w:val="0"/>
-          <w:numId w:val="1"/>
+          <w:numId w:val="5"/>
         </w:numPr>
         <w:rPr>
           <w:rFonts w:ascii="Times New Roman" w:hAnsi="Times New Roman" w:cs="Times New Roman"/>
           <w:sz w:val="24"/>
           <w:szCs w:val="24"/>
-        </w:rPr>
-      </w:pPr>
-      <w:proofErr w:type="spellStart"/>
-      <w:r>
-        <w:rPr>
-          <w:rFonts w:ascii="Times New Roman" w:hAnsi="Times New Roman" w:cs="Times New Roman"/>
-          <w:sz w:val="24"/>
-          <w:szCs w:val="24"/>
-        </w:rPr>
-        <w:t>Married</w:t>
-      </w:r>
-      <w:proofErr w:type="spellEnd"/>
-      <w:r>
-        <w:rPr>
-          <w:rFonts w:ascii="Times New Roman" w:hAnsi="Times New Roman" w:cs="Times New Roman"/>
-          <w:sz w:val="24"/>
-          <w:szCs w:val="24"/>
-        </w:rPr>
-        <w:t xml:space="preserve"> </w:t>
-      </w:r>
-    </w:p>
-    <w:p>
-      <w:pPr>
+          <w:lang w:val="en-US"/>
+        </w:rPr>
+      </w:pPr>
+      <w:r>
+        <w:rPr>
+          <w:rFonts w:ascii="Times New Roman" w:hAnsi="Times New Roman" w:cs="Times New Roman"/>
+          <w:sz w:val="24"/>
+          <w:szCs w:val="24"/>
+          <w:lang w:val="en-US"/>
+        </w:rPr>
+        <w:t>Python 3.13,</w:t>
+      </w:r>
+    </w:p>
+    <w:p>
+      <w:pPr>
+        <w:pStyle w:val="ListParagraph"/>
         <w:numPr>
           <w:ilvl w:val="0"/>
-          <w:numId w:val="1"/>
+          <w:numId w:val="5"/>
         </w:numPr>
         <w:rPr>
           <w:rFonts w:ascii="Times New Roman" w:hAnsi="Times New Roman" w:cs="Times New Roman"/>
           <w:sz w:val="24"/>
           <w:szCs w:val="24"/>
-        </w:rPr>
-      </w:pPr>
-      <w:proofErr w:type="spellStart"/>
-      <w:r>
-        <w:rPr>
-          <w:rFonts w:ascii="Times New Roman" w:hAnsi="Times New Roman" w:cs="Times New Roman"/>
-          <w:sz w:val="24"/>
-          <w:szCs w:val="24"/>
-        </w:rPr>
-        <w:t>Dependents</w:t>
-      </w:r>
-      <w:proofErr w:type="spellEnd"/>
-      <w:r>
-        <w:rPr>
-          <w:rFonts w:ascii="Times New Roman" w:hAnsi="Times New Roman" w:cs="Times New Roman"/>
-          <w:sz w:val="24"/>
-          <w:szCs w:val="24"/>
-        </w:rPr>
-        <w:t xml:space="preserve"> </w:t>
-      </w:r>
-    </w:p>
-    <w:p>
-      <w:pPr>
+          <w:lang w:val="en-US"/>
+        </w:rPr>
+      </w:pPr>
+      <w:r>
+        <w:rPr>
+          <w:rFonts w:ascii="Times New Roman" w:hAnsi="Times New Roman" w:cs="Times New Roman"/>
+          <w:sz w:val="24"/>
+          <w:szCs w:val="24"/>
+          <w:lang w:val="en-US"/>
+        </w:rPr>
+        <w:t>Streamlit 1.41.1,</w:t>
+      </w:r>
+    </w:p>
+    <w:p>
+      <w:pPr>
+        <w:pStyle w:val="ListParagraph"/>
         <w:numPr>
           <w:ilvl w:val="0"/>
-          <w:numId w:val="1"/>
+          <w:numId w:val="5"/>
         </w:numPr>
         <w:rPr>
           <w:rFonts w:ascii="Times New Roman" w:hAnsi="Times New Roman" w:cs="Times New Roman"/>
           <w:sz w:val="24"/>
           <w:szCs w:val="24"/>
-        </w:rPr>
-      </w:pPr>
-      <w:proofErr w:type="spellStart"/>
-      <w:r>
-        <w:rPr>
-          <w:rFonts w:ascii="Times New Roman" w:hAnsi="Times New Roman" w:cs="Times New Roman"/>
-          <w:sz w:val="24"/>
-          <w:szCs w:val="24"/>
-        </w:rPr>
-        <w:t>Education</w:t>
-      </w:r>
-      <w:proofErr w:type="spellEnd"/>
-      <w:r>
-        <w:rPr>
-          <w:rFonts w:ascii="Times New Roman" w:hAnsi="Times New Roman" w:cs="Times New Roman"/>
-          <w:sz w:val="24"/>
-          <w:szCs w:val="24"/>
-        </w:rPr>
-        <w:t xml:space="preserve"> </w:t>
-      </w:r>
-    </w:p>
-    <w:p>
-      <w:pPr>
+          <w:lang w:val="en-US"/>
+        </w:rPr>
+      </w:pPr>
+      <w:r>
+        <w:rPr>
+          <w:rFonts w:ascii="Times New Roman" w:hAnsi="Times New Roman" w:cs="Times New Roman"/>
+          <w:sz w:val="24"/>
+          <w:szCs w:val="24"/>
+          <w:lang w:val="en-US"/>
+        </w:rPr>
+        <w:t>scikit-learn 1.6.1.</w:t>
+      </w:r>
+    </w:p>
+    <w:p>
+      <w:pPr>
+        <w:rPr>
+          <w:rFonts w:ascii="Times New Roman" w:hAnsi="Times New Roman" w:cs="Times New Roman"/>
+          <w:sz w:val="24"/>
+          <w:szCs w:val="24"/>
+        </w:rPr>
+      </w:pPr>
+      <w:r>
+        <w:rPr>
+          <w:rFonts w:ascii="Times New Roman" w:hAnsi="Times New Roman" w:cs="Times New Roman"/>
+          <w:sz w:val="24"/>
+          <w:szCs w:val="24"/>
+        </w:rPr>
+        <w:t>Aplikacja była testowana na przeglądarkach Chrome/OperaGX.</w:t>
+      </w:r>
+    </w:p>
+    <w:p>
+      <w:pPr>
+        <w:rPr>
+          <w:rFonts w:ascii="Times New Roman" w:hAnsi="Times New Roman" w:cs="Times New Roman"/>
+          <w:sz w:val="24"/>
+          <w:szCs w:val="24"/>
+        </w:rPr>
+      </w:pPr>
+      <w:r>
+        <w:rPr>
+          <w:rFonts w:ascii="Times New Roman" w:hAnsi="Times New Roman" w:cs="Times New Roman"/>
+          <w:b/>
+          <w:bCs/>
+          <w:sz w:val="24"/>
+          <w:szCs w:val="24"/>
+        </w:rPr>
+        <w:lastRenderedPageBreak/>
+        <w:t>Walidacja i obsługa błędów</w:t>
+      </w:r>
+    </w:p>
+    <w:p>
+      <w:pPr>
+        <w:rPr>
+          <w:rFonts w:ascii="Times New Roman" w:hAnsi="Times New Roman" w:cs="Times New Roman"/>
+          <w:sz w:val="24"/>
+          <w:szCs w:val="24"/>
+        </w:rPr>
+      </w:pPr>
+      <w:r>
+        <w:rPr>
+          <w:rFonts w:ascii="Times New Roman" w:hAnsi="Times New Roman" w:cs="Times New Roman"/>
+          <w:sz w:val="24"/>
+          <w:szCs w:val="24"/>
+        </w:rPr>
+        <w:t>Przed wykonaniem predykcji aplikacja sprawdza poprawność podstawowych danych formularza. Dochód wnioskodawcy oraz wnioskowana kwota kredytu muszą być większe od zera. Jeżeli użytkownik zadeklaruje współwnioskodawcę, wymagane jest podanie jego dochodu.</w:t>
+      </w:r>
+    </w:p>
+    <w:p>
+      <w:pPr>
+        <w:rPr>
+          <w:rFonts w:ascii="Times New Roman" w:hAnsi="Times New Roman" w:cs="Times New Roman"/>
+          <w:sz w:val="24"/>
+          <w:szCs w:val="24"/>
+        </w:rPr>
+      </w:pPr>
+      <w:r>
+        <w:rPr>
+          <w:rFonts w:ascii="Times New Roman" w:hAnsi="Times New Roman" w:cs="Times New Roman"/>
+          <w:sz w:val="24"/>
+          <w:szCs w:val="24"/>
+        </w:rPr>
+        <w:t>Aplikacja sprawdza również dostępność i zgodność modelu. Obsługiwane są następujące sytuacje:</w:t>
+      </w:r>
+    </w:p>
+    <w:p>
+      <w:pPr>
+        <w:pStyle w:val="ListParagraph"/>
         <w:numPr>
           <w:ilvl w:val="0"/>
-          <w:numId w:val="1"/>
+          <w:numId w:val="7"/>
         </w:numPr>
         <w:rPr>
           <w:rFonts w:ascii="Times New Roman" w:hAnsi="Times New Roman" w:cs="Times New Roman"/>
@@ -310,30 +746,21 @@
           <w:szCs w:val="24"/>
         </w:rPr>
       </w:pPr>
-      <w:proofErr w:type="spellStart"/>
-      <w:r>
-        <w:rPr>
-          <w:rFonts w:ascii="Times New Roman" w:hAnsi="Times New Roman" w:cs="Times New Roman"/>
-          <w:sz w:val="24"/>
-          <w:szCs w:val="24"/>
-        </w:rPr>
-        <w:t>Self_Employed</w:t>
-      </w:r>
-      <w:proofErr w:type="spellEnd"/>
-      <w:r>
-        <w:rPr>
-          <w:rFonts w:ascii="Times New Roman" w:hAnsi="Times New Roman" w:cs="Times New Roman"/>
-          <w:sz w:val="24"/>
-          <w:szCs w:val="24"/>
-        </w:rPr>
-        <w:t xml:space="preserve"> </w:t>
-      </w:r>
-    </w:p>
-    <w:p>
-      <w:pPr>
+      <w:r>
+        <w:rPr>
+          <w:rFonts w:ascii="Times New Roman" w:hAnsi="Times New Roman" w:cs="Times New Roman"/>
+          <w:sz w:val="24"/>
+          <w:szCs w:val="24"/>
+        </w:rPr>
+        <w:t>brak pliku modelu,</w:t>
+      </w:r>
+    </w:p>
+    <w:p>
+      <w:pPr>
+        <w:pStyle w:val="ListParagraph"/>
         <w:numPr>
           <w:ilvl w:val="0"/>
-          <w:numId w:val="1"/>
+          <w:numId w:val="7"/>
         </w:numPr>
         <w:rPr>
           <w:rFonts w:ascii="Times New Roman" w:hAnsi="Times New Roman" w:cs="Times New Roman"/>
@@ -341,30 +768,21 @@
           <w:szCs w:val="24"/>
         </w:rPr>
       </w:pPr>
-      <w:proofErr w:type="spellStart"/>
-      <w:r>
-        <w:rPr>
-          <w:rFonts w:ascii="Times New Roman" w:hAnsi="Times New Roman" w:cs="Times New Roman"/>
-          <w:sz w:val="24"/>
-          <w:szCs w:val="24"/>
-        </w:rPr>
-        <w:t>ApplicantIncome</w:t>
-      </w:r>
-      <w:proofErr w:type="spellEnd"/>
-      <w:r>
-        <w:rPr>
-          <w:rFonts w:ascii="Times New Roman" w:hAnsi="Times New Roman" w:cs="Times New Roman"/>
-          <w:sz w:val="24"/>
-          <w:szCs w:val="24"/>
-        </w:rPr>
-        <w:t xml:space="preserve"> </w:t>
-      </w:r>
-    </w:p>
-    <w:p>
-      <w:pPr>
+      <w:r>
+        <w:rPr>
+          <w:rFonts w:ascii="Times New Roman" w:hAnsi="Times New Roman" w:cs="Times New Roman"/>
+          <w:sz w:val="24"/>
+          <w:szCs w:val="24"/>
+        </w:rPr>
+        <w:t>uszkodzony plik modelu,</w:t>
+      </w:r>
+    </w:p>
+    <w:p>
+      <w:pPr>
+        <w:pStyle w:val="ListParagraph"/>
         <w:numPr>
           <w:ilvl w:val="0"/>
-          <w:numId w:val="1"/>
+          <w:numId w:val="7"/>
         </w:numPr>
         <w:rPr>
           <w:rFonts w:ascii="Times New Roman" w:hAnsi="Times New Roman" w:cs="Times New Roman"/>
@@ -372,30 +790,21 @@
           <w:szCs w:val="24"/>
         </w:rPr>
       </w:pPr>
-      <w:proofErr w:type="spellStart"/>
-      <w:r>
-        <w:rPr>
-          <w:rFonts w:ascii="Times New Roman" w:hAnsi="Times New Roman" w:cs="Times New Roman"/>
-          <w:sz w:val="24"/>
-          <w:szCs w:val="24"/>
-        </w:rPr>
-        <w:t>CoapplicantIncome</w:t>
-      </w:r>
-      <w:proofErr w:type="spellEnd"/>
-      <w:r>
-        <w:rPr>
-          <w:rFonts w:ascii="Times New Roman" w:hAnsi="Times New Roman" w:cs="Times New Roman"/>
-          <w:sz w:val="24"/>
-          <w:szCs w:val="24"/>
-        </w:rPr>
-        <w:t xml:space="preserve"> </w:t>
-      </w:r>
-    </w:p>
-    <w:p>
-      <w:pPr>
+      <w:r>
+        <w:rPr>
+          <w:rFonts w:ascii="Times New Roman" w:hAnsi="Times New Roman" w:cs="Times New Roman"/>
+          <w:sz w:val="24"/>
+          <w:szCs w:val="24"/>
+        </w:rPr>
+        <w:t>model wykorzystujący inny zestaw lub kolejność cech,</w:t>
+      </w:r>
+    </w:p>
+    <w:p>
+      <w:pPr>
+        <w:pStyle w:val="ListParagraph"/>
         <w:numPr>
           <w:ilvl w:val="0"/>
-          <w:numId w:val="1"/>
+          <w:numId w:val="7"/>
         </w:numPr>
         <w:rPr>
           <w:rFonts w:ascii="Times New Roman" w:hAnsi="Times New Roman" w:cs="Times New Roman"/>
@@ -403,30 +812,21 @@
           <w:szCs w:val="24"/>
         </w:rPr>
       </w:pPr>
-      <w:proofErr w:type="spellStart"/>
-      <w:r>
-        <w:rPr>
-          <w:rFonts w:ascii="Times New Roman" w:hAnsi="Times New Roman" w:cs="Times New Roman"/>
-          <w:sz w:val="24"/>
-          <w:szCs w:val="24"/>
-        </w:rPr>
-        <w:t>LoanAmount</w:t>
-      </w:r>
-      <w:proofErr w:type="spellEnd"/>
-      <w:r>
-        <w:rPr>
-          <w:rFonts w:ascii="Times New Roman" w:hAnsi="Times New Roman" w:cs="Times New Roman"/>
-          <w:sz w:val="24"/>
-          <w:szCs w:val="24"/>
-        </w:rPr>
-        <w:t xml:space="preserve"> </w:t>
-      </w:r>
-    </w:p>
-    <w:p>
-      <w:pPr>
+      <w:r>
+        <w:rPr>
+          <w:rFonts w:ascii="Times New Roman" w:hAnsi="Times New Roman" w:cs="Times New Roman"/>
+          <w:sz w:val="24"/>
+          <w:szCs w:val="24"/>
+        </w:rPr>
+        <w:t>plik, który nie zawiera modelu predykcyjnego,</w:t>
+      </w:r>
+    </w:p>
+    <w:p>
+      <w:pPr>
+        <w:pStyle w:val="ListParagraph"/>
         <w:numPr>
           <w:ilvl w:val="0"/>
-          <w:numId w:val="1"/>
+          <w:numId w:val="7"/>
         </w:numPr>
         <w:rPr>
           <w:rFonts w:ascii="Times New Roman" w:hAnsi="Times New Roman" w:cs="Times New Roman"/>
@@ -434,30 +834,59 @@
           <w:szCs w:val="24"/>
         </w:rPr>
       </w:pPr>
-      <w:proofErr w:type="spellStart"/>
-      <w:r>
-        <w:rPr>
-          <w:rFonts w:ascii="Times New Roman" w:hAnsi="Times New Roman" w:cs="Times New Roman"/>
-          <w:sz w:val="24"/>
-          <w:szCs w:val="24"/>
-        </w:rPr>
-        <w:t>Loan_Amount_Term</w:t>
-      </w:r>
-      <w:proofErr w:type="spellEnd"/>
-      <w:r>
-        <w:rPr>
-          <w:rFonts w:ascii="Times New Roman" w:hAnsi="Times New Roman" w:cs="Times New Roman"/>
-          <w:sz w:val="24"/>
-          <w:szCs w:val="24"/>
-        </w:rPr>
-        <w:t xml:space="preserve"> </w:t>
-      </w:r>
-    </w:p>
-    <w:p>
-      <w:pPr>
+      <w:r>
+        <w:rPr>
+          <w:rFonts w:ascii="Times New Roman" w:hAnsi="Times New Roman" w:cs="Times New Roman"/>
+          <w:sz w:val="24"/>
+          <w:szCs w:val="24"/>
+        </w:rPr>
+        <w:t>błąd podczas wykonywania predykcji.</w:t>
+      </w:r>
+    </w:p>
+    <w:p>
+      <w:pPr>
+        <w:rPr>
+          <w:rFonts w:ascii="Times New Roman" w:hAnsi="Times New Roman" w:cs="Times New Roman"/>
+          <w:b/>
+          <w:bCs/>
+          <w:sz w:val="24"/>
+          <w:szCs w:val="24"/>
+        </w:rPr>
+      </w:pPr>
+      <w:r>
+        <w:rPr>
+          <w:rFonts w:ascii="Times New Roman" w:hAnsi="Times New Roman" w:cs="Times New Roman"/>
+          <w:b/>
+          <w:bCs/>
+          <w:sz w:val="24"/>
+          <w:szCs w:val="24"/>
+        </w:rPr>
+        <w:t>Podział pracy</w:t>
+      </w:r>
+    </w:p>
+    <w:p>
+      <w:pPr>
+        <w:rPr>
+          <w:rFonts w:ascii="Times New Roman" w:hAnsi="Times New Roman" w:cs="Times New Roman"/>
+          <w:sz w:val="24"/>
+          <w:szCs w:val="24"/>
+        </w:rPr>
+      </w:pPr>
+      <w:r>
+        <w:rPr>
+          <w:rFonts w:ascii="Times New Roman" w:hAnsi="Times New Roman" w:cs="Times New Roman"/>
+          <w:sz w:val="24"/>
+          <w:szCs w:val="24"/>
+        </w:rPr>
+        <w:t>Piotr Balcerzak</w:t>
+      </w:r>
+    </w:p>
+    <w:p>
+      <w:pPr>
+        <w:pStyle w:val="ListParagraph"/>
         <w:numPr>
           <w:ilvl w:val="0"/>
-          <w:numId w:val="1"/>
+          <w:numId w:val="8"/>
         </w:numPr>
         <w:rPr>
           <w:rFonts w:ascii="Times New Roman" w:hAnsi="Times New Roman" w:cs="Times New Roman"/>
@@ -465,30 +894,21 @@
           <w:szCs w:val="24"/>
         </w:rPr>
       </w:pPr>
-      <w:proofErr w:type="spellStart"/>
-      <w:r>
-        <w:rPr>
-          <w:rFonts w:ascii="Times New Roman" w:hAnsi="Times New Roman" w:cs="Times New Roman"/>
-          <w:sz w:val="24"/>
-          <w:szCs w:val="24"/>
-        </w:rPr>
-        <w:t>Credit_History</w:t>
-      </w:r>
-      <w:proofErr w:type="spellEnd"/>
-      <w:r>
-        <w:rPr>
-          <w:rFonts w:ascii="Times New Roman" w:hAnsi="Times New Roman" w:cs="Times New Roman"/>
-          <w:sz w:val="24"/>
-          <w:szCs w:val="24"/>
-        </w:rPr>
-        <w:t xml:space="preserve"> </w:t>
-      </w:r>
-    </w:p>
-    <w:p>
-      <w:pPr>
+      <w:r>
+        <w:rPr>
+          <w:rFonts w:ascii="Times New Roman" w:hAnsi="Times New Roman" w:cs="Times New Roman"/>
+          <w:sz w:val="24"/>
+          <w:szCs w:val="24"/>
+        </w:rPr>
+        <w:t>przygotowanie i analiza datasetu,</w:t>
+      </w:r>
+    </w:p>
+    <w:p>
+      <w:pPr>
+        <w:pStyle w:val="ListParagraph"/>
         <w:numPr>
           <w:ilvl w:val="0"/>
-          <w:numId w:val="1"/>
+          <w:numId w:val="8"/>
         </w:numPr>
         <w:rPr>
           <w:rFonts w:ascii="Times New Roman" w:hAnsi="Times New Roman" w:cs="Times New Roman"/>
@@ -496,51 +916,21 @@
           <w:szCs w:val="24"/>
         </w:rPr>
       </w:pPr>
-      <w:proofErr w:type="spellStart"/>
-      <w:r>
-        <w:rPr>
-          <w:rFonts w:ascii="Times New Roman" w:hAnsi="Times New Roman" w:cs="Times New Roman"/>
-          <w:sz w:val="24"/>
-          <w:szCs w:val="24"/>
-        </w:rPr>
-        <w:t>Property_Area</w:t>
-      </w:r>
-      <w:proofErr w:type="spellEnd"/>
-      <w:r>
-        <w:rPr>
-          <w:rFonts w:ascii="Times New Roman" w:hAnsi="Times New Roman" w:cs="Times New Roman"/>
-          <w:sz w:val="24"/>
-          <w:szCs w:val="24"/>
-        </w:rPr>
-        <w:t xml:space="preserve"> </w:t>
-      </w:r>
-    </w:p>
-    <w:p>
-      <w:pPr>
-        <w:rPr>
-          <w:rFonts w:ascii="Times New Roman" w:hAnsi="Times New Roman" w:cs="Times New Roman"/>
-          <w:b/>
-          <w:bCs/>
-          <w:sz w:val="24"/>
-          <w:szCs w:val="24"/>
-        </w:rPr>
-      </w:pPr>
-      <w:r>
-        <w:rPr>
-          <w:rFonts w:ascii="Times New Roman" w:hAnsi="Times New Roman" w:cs="Times New Roman"/>
-          <w:b/>
-          <w:bCs/>
-          <w:sz w:val="24"/>
-          <w:szCs w:val="24"/>
-        </w:rPr>
-        <w:t>Wektor wyjściowy</w:t>
-      </w:r>
-    </w:p>
-    <w:p>
-      <w:pPr>
+      <w:r>
+        <w:rPr>
+          <w:rFonts w:ascii="Times New Roman" w:hAnsi="Times New Roman" w:cs="Times New Roman"/>
+          <w:sz w:val="24"/>
+          <w:szCs w:val="24"/>
+        </w:rPr>
+        <w:t>preprocessing danych,</w:t>
+      </w:r>
+    </w:p>
+    <w:p>
+      <w:pPr>
+        <w:pStyle w:val="ListParagraph"/>
         <w:numPr>
           <w:ilvl w:val="0"/>
-          <w:numId w:val="2"/>
+          <w:numId w:val="8"/>
         </w:numPr>
         <w:rPr>
           <w:rFonts w:ascii="Times New Roman" w:hAnsi="Times New Roman" w:cs="Times New Roman"/>
@@ -554,14 +944,15 @@
           <w:sz w:val="24"/>
           <w:szCs w:val="24"/>
         </w:rPr>
-        <w:t xml:space="preserve">Y / 1 – zaakceptowany </w:t>
-      </w:r>
-    </w:p>
-    <w:p>
-      <w:pPr>
+        <w:t>trenowanie modeli uczenia maszynowego,</w:t>
+      </w:r>
+    </w:p>
+    <w:p>
+      <w:pPr>
+        <w:pStyle w:val="ListParagraph"/>
         <w:numPr>
           <w:ilvl w:val="0"/>
-          <w:numId w:val="2"/>
+          <w:numId w:val="8"/>
         </w:numPr>
         <w:rPr>
           <w:rFonts w:ascii="Times New Roman" w:hAnsi="Times New Roman" w:cs="Times New Roman"/>
@@ -575,73 +966,15 @@
           <w:sz w:val="24"/>
           <w:szCs w:val="24"/>
         </w:rPr>
-        <w:t xml:space="preserve">N / 0 – odrzucony </w:t>
-      </w:r>
-    </w:p>
-    <w:p>
-      <w:pPr>
-        <w:rPr>
-          <w:rFonts w:ascii="Times New Roman" w:hAnsi="Times New Roman" w:cs="Times New Roman"/>
-          <w:b/>
-          <w:bCs/>
-          <w:sz w:val="24"/>
-          <w:szCs w:val="24"/>
-        </w:rPr>
-      </w:pPr>
-      <w:r>
-        <w:rPr>
-          <w:rFonts w:ascii="Times New Roman" w:hAnsi="Times New Roman" w:cs="Times New Roman"/>
-          <w:b/>
-          <w:bCs/>
-          <w:sz w:val="24"/>
-          <w:szCs w:val="24"/>
-        </w:rPr>
-        <w:t>Uruchomienie</w:t>
-      </w:r>
-    </w:p>
-    <w:p>
-      <w:pPr>
-        <w:rPr>
-          <w:rFonts w:ascii="Times New Roman" w:hAnsi="Times New Roman" w:cs="Times New Roman"/>
-          <w:sz w:val="24"/>
-          <w:szCs w:val="24"/>
-        </w:rPr>
-      </w:pPr>
-      <w:r>
-        <w:rPr>
-          <w:rFonts w:ascii="Times New Roman" w:hAnsi="Times New Roman" w:cs="Times New Roman"/>
-          <w:sz w:val="24"/>
-          <w:szCs w:val="24"/>
-        </w:rPr>
-        <w:t>Uruchomienie pliku run.bat.</w:t>
-      </w:r>
-    </w:p>
-    <w:p>
-      <w:pPr>
-        <w:rPr>
-          <w:rFonts w:ascii="Times New Roman" w:hAnsi="Times New Roman" w:cs="Times New Roman"/>
-          <w:b/>
-          <w:bCs/>
-          <w:sz w:val="24"/>
-          <w:szCs w:val="24"/>
-        </w:rPr>
-      </w:pPr>
-      <w:r>
-        <w:rPr>
-          <w:rFonts w:ascii="Times New Roman" w:hAnsi="Times New Roman" w:cs="Times New Roman"/>
-          <w:b/>
-          <w:bCs/>
-          <w:sz w:val="24"/>
-          <w:szCs w:val="24"/>
-        </w:rPr>
-        <w:t>System testowy</w:t>
-      </w:r>
-    </w:p>
-    <w:p>
-      <w:pPr>
+        <w:t>porównanie skuteczności modeli,</w:t>
+      </w:r>
+    </w:p>
+    <w:p>
+      <w:pPr>
+        <w:pStyle w:val="ListParagraph"/>
         <w:numPr>
           <w:ilvl w:val="0"/>
-          <w:numId w:val="3"/>
+          <w:numId w:val="8"/>
         </w:numPr>
         <w:rPr>
           <w:rFonts w:ascii="Times New Roman" w:hAnsi="Times New Roman" w:cs="Times New Roman"/>
@@ -655,14 +988,15 @@
           <w:sz w:val="24"/>
           <w:szCs w:val="24"/>
         </w:rPr>
-        <w:t xml:space="preserve">Windows 11 </w:t>
-      </w:r>
-    </w:p>
-    <w:p>
-      <w:pPr>
+        <w:t>wybór najlepszego modelu,</w:t>
+      </w:r>
+    </w:p>
+    <w:p>
+      <w:pPr>
+        <w:pStyle w:val="ListParagraph"/>
         <w:numPr>
           <w:ilvl w:val="0"/>
-          <w:numId w:val="3"/>
+          <w:numId w:val="8"/>
         </w:numPr>
         <w:rPr>
           <w:rFonts w:ascii="Times New Roman" w:hAnsi="Times New Roman" w:cs="Times New Roman"/>
@@ -670,30 +1004,38 @@
           <w:szCs w:val="24"/>
         </w:rPr>
       </w:pPr>
-      <w:proofErr w:type="spellStart"/>
-      <w:r>
-        <w:rPr>
-          <w:rFonts w:ascii="Times New Roman" w:hAnsi="Times New Roman" w:cs="Times New Roman"/>
-          <w:sz w:val="24"/>
-          <w:szCs w:val="24"/>
-        </w:rPr>
-        <w:t>Python</w:t>
-      </w:r>
-      <w:proofErr w:type="spellEnd"/>
-      <w:r>
-        <w:rPr>
-          <w:rFonts w:ascii="Times New Roman" w:hAnsi="Times New Roman" w:cs="Times New Roman"/>
-          <w:sz w:val="24"/>
-          <w:szCs w:val="24"/>
-        </w:rPr>
-        <w:t xml:space="preserve"> 3.14 </w:t>
-      </w:r>
-    </w:p>
-    <w:p>
-      <w:pPr>
+      <w:r>
+        <w:rPr>
+          <w:rFonts w:ascii="Times New Roman" w:hAnsi="Times New Roman" w:cs="Times New Roman"/>
+          <w:sz w:val="24"/>
+          <w:szCs w:val="24"/>
+        </w:rPr>
+        <w:t>zapis modelu do pliku .pkl.</w:t>
+      </w:r>
+    </w:p>
+    <w:p>
+      <w:pPr>
+        <w:rPr>
+          <w:rFonts w:ascii="Times New Roman" w:hAnsi="Times New Roman" w:cs="Times New Roman"/>
+          <w:sz w:val="24"/>
+          <w:szCs w:val="24"/>
+        </w:rPr>
+      </w:pPr>
+      <w:r>
+        <w:rPr>
+          <w:rFonts w:ascii="Times New Roman" w:hAnsi="Times New Roman" w:cs="Times New Roman"/>
+          <w:sz w:val="24"/>
+          <w:szCs w:val="24"/>
+        </w:rPr>
+        <w:t>Patrycja Ługiewicz</w:t>
+      </w:r>
+    </w:p>
+    <w:p>
+      <w:pPr>
+        <w:pStyle w:val="ListParagraph"/>
         <w:numPr>
           <w:ilvl w:val="0"/>
-          <w:numId w:val="3"/>
+          <w:numId w:val="9"/>
         </w:numPr>
         <w:rPr>
           <w:rFonts w:ascii="Times New Roman" w:hAnsi="Times New Roman" w:cs="Times New Roman"/>
@@ -707,413 +1049,161 @@
           <w:sz w:val="24"/>
           <w:szCs w:val="24"/>
         </w:rPr>
-        <w:t xml:space="preserve">Chrome / Opera GX </w:t>
-      </w:r>
-    </w:p>
-    <w:p>
-      <w:pPr>
-        <w:rPr>
-          <w:rFonts w:ascii="Times New Roman" w:hAnsi="Times New Roman" w:cs="Times New Roman"/>
-          <w:b/>
-          <w:bCs/>
-          <w:sz w:val="24"/>
-          <w:szCs w:val="24"/>
-        </w:rPr>
-      </w:pPr>
-    </w:p>
-    <w:p>
-      <w:pPr>
-        <w:rPr>
-          <w:rFonts w:ascii="Times New Roman" w:hAnsi="Times New Roman" w:cs="Times New Roman"/>
-          <w:b/>
-          <w:bCs/>
-          <w:sz w:val="24"/>
-          <w:szCs w:val="24"/>
-        </w:rPr>
-      </w:pPr>
-      <w:r>
-        <w:rPr>
-          <w:rFonts w:ascii="Times New Roman" w:hAnsi="Times New Roman" w:cs="Times New Roman"/>
-          <w:b/>
-          <w:bCs/>
-          <w:sz w:val="24"/>
-          <w:szCs w:val="24"/>
-        </w:rPr>
-        <w:lastRenderedPageBreak/>
-        <w:t>Podział pracy</w:t>
-      </w:r>
-      <w:r>
-        <w:rPr>
-          <w:rFonts w:ascii="Times New Roman" w:hAnsi="Times New Roman" w:cs="Times New Roman"/>
-          <w:b/>
-          <w:bCs/>
-          <w:sz w:val="24"/>
-          <w:szCs w:val="24"/>
-        </w:rPr>
-        <w:br/>
-      </w:r>
-    </w:p>
-    <w:p>
-      <w:pPr>
-        <w:rPr>
-          <w:rFonts w:ascii="Times New Roman" w:hAnsi="Times New Roman" w:cs="Times New Roman"/>
-          <w:b/>
-          <w:bCs/>
-          <w:sz w:val="24"/>
-          <w:szCs w:val="24"/>
-        </w:rPr>
-      </w:pPr>
-      <w:r>
-        <w:rPr>
-          <w:rFonts w:ascii="Times New Roman" w:hAnsi="Times New Roman" w:cs="Times New Roman"/>
-          <w:b/>
-          <w:bCs/>
-          <w:sz w:val="24"/>
-          <w:szCs w:val="24"/>
-        </w:rPr>
-        <w:t>Piotr Balcerzak</w:t>
-      </w:r>
-    </w:p>
-    <w:p>
-      <w:pPr>
-        <w:rPr>
-          <w:rFonts w:ascii="Times New Roman" w:hAnsi="Times New Roman" w:cs="Times New Roman"/>
-          <w:sz w:val="24"/>
-          <w:szCs w:val="24"/>
-        </w:rPr>
-      </w:pPr>
-      <w:r>
-        <w:rPr>
-          <w:rFonts w:ascii="Times New Roman" w:hAnsi="Times New Roman" w:cs="Times New Roman"/>
-          <w:sz w:val="24"/>
-          <w:szCs w:val="24"/>
-        </w:rPr>
-        <w:t xml:space="preserve">- przygotowanie i analiza </w:t>
-      </w:r>
-      <w:proofErr w:type="spellStart"/>
-      <w:r>
-        <w:rPr>
-          <w:rFonts w:ascii="Times New Roman" w:hAnsi="Times New Roman" w:cs="Times New Roman"/>
-          <w:sz w:val="24"/>
-          <w:szCs w:val="24"/>
-        </w:rPr>
-        <w:t>datasetu</w:t>
-      </w:r>
-      <w:proofErr w:type="spellEnd"/>
-      <w:r>
-        <w:rPr>
-          <w:rFonts w:ascii="Times New Roman" w:hAnsi="Times New Roman" w:cs="Times New Roman"/>
-          <w:sz w:val="24"/>
-          <w:szCs w:val="24"/>
-        </w:rPr>
-        <w:t>,</w:t>
-      </w:r>
-    </w:p>
-    <w:p>
-      <w:pPr>
-        <w:rPr>
-          <w:rFonts w:ascii="Times New Roman" w:hAnsi="Times New Roman" w:cs="Times New Roman"/>
-          <w:sz w:val="24"/>
-          <w:szCs w:val="24"/>
-        </w:rPr>
-      </w:pPr>
-      <w:r>
-        <w:rPr>
-          <w:rFonts w:ascii="Times New Roman" w:hAnsi="Times New Roman" w:cs="Times New Roman"/>
-          <w:sz w:val="24"/>
-          <w:szCs w:val="24"/>
-        </w:rPr>
-        <w:t xml:space="preserve">- </w:t>
-      </w:r>
-      <w:proofErr w:type="spellStart"/>
-      <w:r>
-        <w:rPr>
-          <w:rFonts w:ascii="Times New Roman" w:hAnsi="Times New Roman" w:cs="Times New Roman"/>
-          <w:sz w:val="24"/>
-          <w:szCs w:val="24"/>
-        </w:rPr>
-        <w:t>preprocessing</w:t>
-      </w:r>
-      <w:proofErr w:type="spellEnd"/>
-      <w:r>
-        <w:rPr>
-          <w:rFonts w:ascii="Times New Roman" w:hAnsi="Times New Roman" w:cs="Times New Roman"/>
-          <w:sz w:val="24"/>
-          <w:szCs w:val="24"/>
-        </w:rPr>
-        <w:t xml:space="preserve"> danych,</w:t>
-      </w:r>
-    </w:p>
-    <w:p>
-      <w:pPr>
-        <w:rPr>
-          <w:rFonts w:ascii="Times New Roman" w:hAnsi="Times New Roman" w:cs="Times New Roman"/>
-          <w:sz w:val="24"/>
-          <w:szCs w:val="24"/>
-        </w:rPr>
-      </w:pPr>
-      <w:r>
-        <w:rPr>
-          <w:rFonts w:ascii="Times New Roman" w:hAnsi="Times New Roman" w:cs="Times New Roman"/>
-          <w:sz w:val="24"/>
-          <w:szCs w:val="24"/>
-        </w:rPr>
-        <w:t>- trenowanie modeli uczenia maszynowego,</w:t>
-      </w:r>
-    </w:p>
-    <w:p>
-      <w:pPr>
-        <w:rPr>
-          <w:rFonts w:ascii="Times New Roman" w:hAnsi="Times New Roman" w:cs="Times New Roman"/>
-          <w:sz w:val="24"/>
-          <w:szCs w:val="24"/>
-        </w:rPr>
-      </w:pPr>
-      <w:r>
-        <w:rPr>
-          <w:rFonts w:ascii="Times New Roman" w:hAnsi="Times New Roman" w:cs="Times New Roman"/>
-          <w:sz w:val="24"/>
-          <w:szCs w:val="24"/>
-        </w:rPr>
-        <w:t>- porównanie skuteczności modeli,</w:t>
-      </w:r>
-    </w:p>
-    <w:p>
-      <w:pPr>
-        <w:rPr>
-          <w:rFonts w:ascii="Times New Roman" w:hAnsi="Times New Roman" w:cs="Times New Roman"/>
-          <w:sz w:val="24"/>
-          <w:szCs w:val="24"/>
-        </w:rPr>
-      </w:pPr>
-      <w:r>
-        <w:rPr>
-          <w:rFonts w:ascii="Times New Roman" w:hAnsi="Times New Roman" w:cs="Times New Roman"/>
-          <w:sz w:val="24"/>
-          <w:szCs w:val="24"/>
-        </w:rPr>
-        <w:t>- wybór najlepszego modelu,</w:t>
-      </w:r>
-    </w:p>
-    <w:p>
-      <w:pPr>
-        <w:rPr>
-          <w:rFonts w:ascii="Times New Roman" w:hAnsi="Times New Roman" w:cs="Times New Roman"/>
-          <w:sz w:val="24"/>
-          <w:szCs w:val="24"/>
-        </w:rPr>
-      </w:pPr>
-      <w:r>
-        <w:rPr>
-          <w:rFonts w:ascii="Times New Roman" w:hAnsi="Times New Roman" w:cs="Times New Roman"/>
-          <w:sz w:val="24"/>
-          <w:szCs w:val="24"/>
-        </w:rPr>
-        <w:t>- zapis modelu do pliku .</w:t>
-      </w:r>
-      <w:proofErr w:type="spellStart"/>
-      <w:r>
-        <w:rPr>
-          <w:rFonts w:ascii="Times New Roman" w:hAnsi="Times New Roman" w:cs="Times New Roman"/>
-          <w:sz w:val="24"/>
-          <w:szCs w:val="24"/>
-        </w:rPr>
-        <w:t>pkl</w:t>
-      </w:r>
-      <w:proofErr w:type="spellEnd"/>
-      <w:r>
-        <w:rPr>
-          <w:rFonts w:ascii="Times New Roman" w:hAnsi="Times New Roman" w:cs="Times New Roman"/>
-          <w:sz w:val="24"/>
-          <w:szCs w:val="24"/>
-        </w:rPr>
-        <w:t>.</w:t>
-      </w:r>
-    </w:p>
-    <w:p>
-      <w:pPr>
-        <w:rPr>
-          <w:rFonts w:ascii="Times New Roman" w:hAnsi="Times New Roman" w:cs="Times New Roman"/>
-          <w:b/>
-          <w:bCs/>
-          <w:sz w:val="24"/>
-          <w:szCs w:val="24"/>
-        </w:rPr>
-      </w:pPr>
-    </w:p>
-    <w:p>
-      <w:pPr>
-        <w:rPr>
-          <w:rFonts w:ascii="Times New Roman" w:hAnsi="Times New Roman" w:cs="Times New Roman"/>
-          <w:b/>
-          <w:bCs/>
-          <w:sz w:val="24"/>
-          <w:szCs w:val="24"/>
-        </w:rPr>
-      </w:pPr>
-      <w:r>
-        <w:rPr>
-          <w:rFonts w:ascii="Times New Roman" w:hAnsi="Times New Roman" w:cs="Times New Roman"/>
-          <w:b/>
-          <w:bCs/>
-          <w:sz w:val="24"/>
-          <w:szCs w:val="24"/>
-        </w:rPr>
-        <w:t>Patrycja Ługiewicz</w:t>
-      </w:r>
-    </w:p>
-    <w:p>
-      <w:pPr>
-        <w:rPr>
-          <w:rFonts w:ascii="Times New Roman" w:hAnsi="Times New Roman" w:cs="Times New Roman"/>
-          <w:sz w:val="24"/>
-          <w:szCs w:val="24"/>
-        </w:rPr>
-      </w:pPr>
-      <w:r>
-        <w:rPr>
-          <w:rFonts w:ascii="Times New Roman" w:hAnsi="Times New Roman" w:cs="Times New Roman"/>
-          <w:sz w:val="24"/>
-          <w:szCs w:val="24"/>
-        </w:rPr>
-        <w:t>- utworzenie i konfiguracja repozytorium GitHub,</w:t>
-      </w:r>
-    </w:p>
-    <w:p>
-      <w:pPr>
-        <w:rPr>
-          <w:rFonts w:ascii="Times New Roman" w:hAnsi="Times New Roman" w:cs="Times New Roman"/>
-          <w:sz w:val="24"/>
-          <w:szCs w:val="24"/>
-        </w:rPr>
-      </w:pPr>
-      <w:r>
-        <w:rPr>
-          <w:rFonts w:ascii="Times New Roman" w:hAnsi="Times New Roman" w:cs="Times New Roman"/>
-          <w:sz w:val="24"/>
-          <w:szCs w:val="24"/>
-        </w:rPr>
-        <w:t>- przygotowanie struktury projektu,</w:t>
-      </w:r>
-    </w:p>
-    <w:p>
-      <w:pPr>
-        <w:rPr>
-          <w:rFonts w:ascii="Times New Roman" w:hAnsi="Times New Roman" w:cs="Times New Roman"/>
-          <w:sz w:val="24"/>
-          <w:szCs w:val="24"/>
-        </w:rPr>
-      </w:pPr>
-      <w:r>
-        <w:rPr>
-          <w:rFonts w:ascii="Times New Roman" w:hAnsi="Times New Roman" w:cs="Times New Roman"/>
-          <w:sz w:val="24"/>
-          <w:szCs w:val="24"/>
-        </w:rPr>
-        <w:t xml:space="preserve">- implementacja aplikacji webowej w </w:t>
-      </w:r>
-      <w:proofErr w:type="spellStart"/>
-      <w:r>
-        <w:rPr>
-          <w:rFonts w:ascii="Times New Roman" w:hAnsi="Times New Roman" w:cs="Times New Roman"/>
-          <w:sz w:val="24"/>
-          <w:szCs w:val="24"/>
-        </w:rPr>
-        <w:t>Streamlit</w:t>
-      </w:r>
-      <w:proofErr w:type="spellEnd"/>
-      <w:r>
-        <w:rPr>
-          <w:rFonts w:ascii="Times New Roman" w:hAnsi="Times New Roman" w:cs="Times New Roman"/>
-          <w:sz w:val="24"/>
-          <w:szCs w:val="24"/>
-        </w:rPr>
-        <w:t>,</w:t>
-      </w:r>
-    </w:p>
-    <w:p>
-      <w:pPr>
-        <w:rPr>
-          <w:rFonts w:ascii="Times New Roman" w:hAnsi="Times New Roman" w:cs="Times New Roman"/>
-          <w:sz w:val="24"/>
-          <w:szCs w:val="24"/>
-        </w:rPr>
-      </w:pPr>
-      <w:r>
-        <w:rPr>
-          <w:rFonts w:ascii="Times New Roman" w:hAnsi="Times New Roman" w:cs="Times New Roman"/>
-          <w:sz w:val="24"/>
-          <w:szCs w:val="24"/>
-        </w:rPr>
-        <w:t>- stworzenie formularza użytkownika,</w:t>
-      </w:r>
-    </w:p>
-    <w:p>
-      <w:pPr>
-        <w:rPr>
-          <w:rFonts w:ascii="Times New Roman" w:hAnsi="Times New Roman" w:cs="Times New Roman"/>
-          <w:sz w:val="24"/>
-          <w:szCs w:val="24"/>
-        </w:rPr>
-      </w:pPr>
-      <w:r>
-        <w:rPr>
-          <w:rFonts w:ascii="Times New Roman" w:hAnsi="Times New Roman" w:cs="Times New Roman"/>
-          <w:sz w:val="24"/>
-          <w:szCs w:val="24"/>
-        </w:rPr>
-        <w:t>- integracja aplikacji z modelem,</w:t>
-      </w:r>
-    </w:p>
-    <w:p>
-      <w:pPr>
-        <w:rPr>
-          <w:rFonts w:ascii="Times New Roman" w:hAnsi="Times New Roman" w:cs="Times New Roman"/>
-          <w:sz w:val="24"/>
-          <w:szCs w:val="24"/>
-        </w:rPr>
-      </w:pPr>
-      <w:r>
-        <w:rPr>
-          <w:rFonts w:ascii="Times New Roman" w:hAnsi="Times New Roman" w:cs="Times New Roman"/>
-          <w:sz w:val="24"/>
-          <w:szCs w:val="24"/>
-        </w:rPr>
-        <w:t>- przygotowanie README,</w:t>
-      </w:r>
-    </w:p>
-    <w:p>
-      <w:pPr>
-        <w:rPr>
-          <w:rFonts w:ascii="Times New Roman" w:hAnsi="Times New Roman" w:cs="Times New Roman"/>
-          <w:sz w:val="24"/>
-          <w:szCs w:val="24"/>
-        </w:rPr>
-      </w:pPr>
-      <w:r>
-        <w:rPr>
-          <w:rFonts w:ascii="Times New Roman" w:hAnsi="Times New Roman" w:cs="Times New Roman"/>
-          <w:sz w:val="24"/>
-          <w:szCs w:val="24"/>
-        </w:rPr>
-        <w:t>- przygotowanie dokumentacji PDF,</w:t>
-      </w:r>
-    </w:p>
-    <w:p>
-      <w:pPr>
-        <w:rPr>
-          <w:rFonts w:ascii="Times New Roman" w:hAnsi="Times New Roman" w:cs="Times New Roman"/>
-          <w:sz w:val="24"/>
-          <w:szCs w:val="24"/>
-        </w:rPr>
-      </w:pPr>
-      <w:r>
-        <w:rPr>
-          <w:rFonts w:ascii="Times New Roman" w:hAnsi="Times New Roman" w:cs="Times New Roman"/>
-          <w:sz w:val="24"/>
-          <w:szCs w:val="24"/>
-        </w:rPr>
-        <w:t>- przygotowanie prezentacji projektu.</w:t>
+        <w:t>utworzenie i konfiguracja repozytorium GitHub,</w:t>
+      </w:r>
+    </w:p>
+    <w:p>
+      <w:pPr>
+        <w:pStyle w:val="ListParagraph"/>
+        <w:numPr>
+          <w:ilvl w:val="0"/>
+          <w:numId w:val="9"/>
+        </w:numPr>
+        <w:rPr>
+          <w:rFonts w:ascii="Times New Roman" w:hAnsi="Times New Roman" w:cs="Times New Roman"/>
+          <w:sz w:val="24"/>
+          <w:szCs w:val="24"/>
+        </w:rPr>
+      </w:pPr>
+      <w:r>
+        <w:rPr>
+          <w:rFonts w:ascii="Times New Roman" w:hAnsi="Times New Roman" w:cs="Times New Roman"/>
+          <w:sz w:val="24"/>
+          <w:szCs w:val="24"/>
+        </w:rPr>
+        <w:t>przygotowanie struktury projektu,</w:t>
+      </w:r>
+    </w:p>
+    <w:p>
+      <w:pPr>
+        <w:pStyle w:val="ListParagraph"/>
+        <w:numPr>
+          <w:ilvl w:val="0"/>
+          <w:numId w:val="9"/>
+        </w:numPr>
+        <w:rPr>
+          <w:rFonts w:ascii="Times New Roman" w:hAnsi="Times New Roman" w:cs="Times New Roman"/>
+          <w:sz w:val="24"/>
+          <w:szCs w:val="24"/>
+        </w:rPr>
+      </w:pPr>
+      <w:r>
+        <w:rPr>
+          <w:rFonts w:ascii="Times New Roman" w:hAnsi="Times New Roman" w:cs="Times New Roman"/>
+          <w:sz w:val="24"/>
+          <w:szCs w:val="24"/>
+        </w:rPr>
+        <w:t>implementacja aplikacji webowej w Streamlit,</w:t>
+      </w:r>
+    </w:p>
+    <w:p>
+      <w:pPr>
+        <w:pStyle w:val="ListParagraph"/>
+        <w:numPr>
+          <w:ilvl w:val="0"/>
+          <w:numId w:val="9"/>
+        </w:numPr>
+        <w:rPr>
+          <w:rFonts w:ascii="Times New Roman" w:hAnsi="Times New Roman" w:cs="Times New Roman"/>
+          <w:sz w:val="24"/>
+          <w:szCs w:val="24"/>
+        </w:rPr>
+      </w:pPr>
+      <w:r>
+        <w:rPr>
+          <w:rFonts w:ascii="Times New Roman" w:hAnsi="Times New Roman" w:cs="Times New Roman"/>
+          <w:sz w:val="24"/>
+          <w:szCs w:val="24"/>
+        </w:rPr>
+        <w:t>stworzenie formularza użytkownika,</w:t>
+      </w:r>
+    </w:p>
+    <w:p>
+      <w:pPr>
+        <w:pStyle w:val="ListParagraph"/>
+        <w:numPr>
+          <w:ilvl w:val="0"/>
+          <w:numId w:val="9"/>
+        </w:numPr>
+        <w:rPr>
+          <w:rFonts w:ascii="Times New Roman" w:hAnsi="Times New Roman" w:cs="Times New Roman"/>
+          <w:sz w:val="24"/>
+          <w:szCs w:val="24"/>
+        </w:rPr>
+      </w:pPr>
+      <w:r>
+        <w:rPr>
+          <w:rFonts w:ascii="Times New Roman" w:hAnsi="Times New Roman" w:cs="Times New Roman"/>
+          <w:sz w:val="24"/>
+          <w:szCs w:val="24"/>
+        </w:rPr>
+        <w:t>integracja aplikacji z modelem,</w:t>
+      </w:r>
+    </w:p>
+    <w:p>
+      <w:pPr>
+        <w:pStyle w:val="ListParagraph"/>
+        <w:numPr>
+          <w:ilvl w:val="0"/>
+          <w:numId w:val="9"/>
+        </w:numPr>
+        <w:rPr>
+          <w:rFonts w:ascii="Times New Roman" w:hAnsi="Times New Roman" w:cs="Times New Roman"/>
+          <w:sz w:val="24"/>
+          <w:szCs w:val="24"/>
+        </w:rPr>
+      </w:pPr>
+      <w:r>
+        <w:rPr>
+          <w:rFonts w:ascii="Times New Roman" w:hAnsi="Times New Roman" w:cs="Times New Roman"/>
+          <w:sz w:val="24"/>
+          <w:szCs w:val="24"/>
+        </w:rPr>
+        <w:t>przygotowanie README,</w:t>
+      </w:r>
+    </w:p>
+    <w:p>
+      <w:pPr>
+        <w:pStyle w:val="ListParagraph"/>
+        <w:numPr>
+          <w:ilvl w:val="0"/>
+          <w:numId w:val="9"/>
+        </w:numPr>
+        <w:rPr>
+          <w:rFonts w:ascii="Times New Roman" w:hAnsi="Times New Roman" w:cs="Times New Roman"/>
+          <w:sz w:val="24"/>
+          <w:szCs w:val="24"/>
+        </w:rPr>
+      </w:pPr>
+      <w:r>
+        <w:rPr>
+          <w:rFonts w:ascii="Times New Roman" w:hAnsi="Times New Roman" w:cs="Times New Roman"/>
+          <w:sz w:val="24"/>
+          <w:szCs w:val="24"/>
+        </w:rPr>
+        <w:t>przygotowanie dokumentacji,</w:t>
+      </w:r>
+    </w:p>
+    <w:p>
+      <w:pPr>
+        <w:pStyle w:val="ListParagraph"/>
+        <w:numPr>
+          <w:ilvl w:val="0"/>
+          <w:numId w:val="9"/>
+        </w:numPr>
+        <w:rPr>
+          <w:rFonts w:ascii="Times New Roman" w:hAnsi="Times New Roman" w:cs="Times New Roman"/>
+          <w:sz w:val="24"/>
+          <w:szCs w:val="24"/>
+        </w:rPr>
+      </w:pPr>
+      <w:r>
+        <w:rPr>
+          <w:rFonts w:ascii="Times New Roman" w:hAnsi="Times New Roman" w:cs="Times New Roman"/>
+          <w:sz w:val="24"/>
+          <w:szCs w:val="24"/>
+        </w:rPr>
+        <w:t>przygotowanie prezentacji projektu.</w:t>
       </w:r>
     </w:p>
     <w:p>
@@ -1149,6 +1239,318 @@
 <file path=word/numbering.xml><?xml version="1.0" encoding="utf-8"?>
 <w:numbering xmlns:wpc="http://schemas.microsoft.com/office/word/2010/wordprocessingCanvas" xmlns:cx="http://schemas.microsoft.com/office/drawing/2014/chartex" xmlns:cx1="http://schemas.microsoft.com/office/drawing/2015/9/8/chartex" xmlns:cx2="http://schemas.microsoft.com/office/drawing/2015/10/21/chartex" xmlns:cx3="http://schemas.microsoft.com/office/drawing/2016/5/9/chartex" xmlns:cx4="http://schemas.microsoft.com/office/drawing/2016/5/10/chartex" xmlns:cx5="http://schemas.microsoft.com/office/drawing/2016/5/11/chartex" xmlns:cx6="http://schemas.microsoft.com/office/drawing/2016/5/12/chartex" xmlns:cx7="http://schemas.microsoft.com/office/drawing/2016/5/13/chartex" xmlns:cx8="http://schemas.microsoft.com/office/drawing/2016/5/14/chartex" xmlns:mc="http://schemas.openxmlformats.org/markup-compatibility/2006" xmlns:aink="http://schemas.microsoft.com/office/drawing/2016/ink" xmlns:am3d="http://schemas.microsoft.com/office/drawing/2017/model3d" xmlns:o="urn:schemas-microsoft-com:office:office" xmlns:oel="http://schemas.microsoft.com/office/2019/extlst" xmlns:r="http://schemas.openxmlformats.org/officeDocument/2006/relationships" xmlns:m="http://schemas.openxmlformats.org/officeDocument/2006/math" xmlns:v="urn:schemas-microsoft-com:vml" xmlns:wp14="http://schemas.microsoft.com/office/word/2010/wordprocessingDrawing" xmlns:wp="http://schemas.openxmlformats.org/drawingml/2006/wordprocessingDrawing" xmlns:w10="urn:schemas-microsoft-com:office:word" xmlns:w="http://schemas.openxmlformats.org/wordprocessingml/2006/main" xmlns:w14="http://schemas.microsoft.com/office/word/2010/wordml" xmlns:w15="http://schemas.microsoft.com/office/word/2012/wordml" xmlns:w16cex="http://schemas.microsoft.com/office/word/2018/wordml/cex" xmlns:w16cid="http://schemas.microsoft.com/office/word/2016/wordml/cid" xmlns:w16="http://schemas.microsoft.com/office/word/2018/wordml" xmlns:w16du="http://schemas.microsoft.com/office/word/2023/wordml/word16du" xmlns:w16sdtdh="http://schemas.microsoft.com/office/word/2020/wordml/sdtdatahash" xmlns:w16sdtfl="http://schemas.microsoft.com/office/word/2024/wordml/sdtformatlock" xmlns:w16se="http://schemas.microsoft.com/office/word/2015/wordml/symex" xmlns:wpg="http://schemas.microsoft.com/office/word/2010/wordprocessingGroup" xmlns:wpi="http://schemas.microsoft.com/office/word/2010/wordprocessingInk" xmlns:wne="http://schemas.microsoft.com/office/word/2006/wordml" xmlns:wps="http://schemas.microsoft.com/office/word/2010/wordprocessingShape" mc:Ignorable="w14 w15 w16se w16cid w16 w16cex w16sdtdh w16sdtfl w16du wp14">
   <w:abstractNum w:abstractNumId="0" w15:restartNumberingAfterBreak="0">
+    <w:nsid w:val="0B2E0CDD"/>
+    <w:multiLevelType w:val="hybridMultilevel"/>
+    <w:tmpl w:val="955A0D94"/>
+    <w:lvl w:ilvl="0" w:tplc="0415000F">
+      <w:start w:val="1"/>
+      <w:numFmt w:val="decimal"/>
+      <w:lvlText w:val="%1."/>
+      <w:lvlJc w:val="left"/>
+      <w:pPr>
+        <w:ind w:left="1068" w:hanging="360"/>
+      </w:pPr>
+    </w:lvl>
+    <w:lvl w:ilvl="1" w:tplc="04150019" w:tentative="1">
+      <w:start w:val="1"/>
+      <w:numFmt w:val="lowerLetter"/>
+      <w:lvlText w:val="%2."/>
+      <w:lvlJc w:val="left"/>
+      <w:pPr>
+        <w:ind w:left="1788" w:hanging="360"/>
+      </w:pPr>
+    </w:lvl>
+    <w:lvl w:ilvl="2" w:tplc="0415001B" w:tentative="1">
+      <w:start w:val="1"/>
+      <w:numFmt w:val="lowerRoman"/>
+      <w:lvlText w:val="%3."/>
+      <w:lvlJc w:val="right"/>
+      <w:pPr>
+        <w:ind w:left="2508" w:hanging="180"/>
+      </w:pPr>
+    </w:lvl>
+    <w:lvl w:ilvl="3" w:tplc="0415000F" w:tentative="1">
+      <w:start w:val="1"/>
+      <w:numFmt w:val="decimal"/>
+      <w:lvlText w:val="%4."/>
+      <w:lvlJc w:val="left"/>
+      <w:pPr>
+        <w:ind w:left="3228" w:hanging="360"/>
+      </w:pPr>
+    </w:lvl>
+    <w:lvl w:ilvl="4" w:tplc="04150019" w:tentative="1">
+      <w:start w:val="1"/>
+      <w:numFmt w:val="lowerLetter"/>
+      <w:lvlText w:val="%5."/>
+      <w:lvlJc w:val="left"/>
+      <w:pPr>
+        <w:ind w:left="3948" w:hanging="360"/>
+      </w:pPr>
+    </w:lvl>
+    <w:lvl w:ilvl="5" w:tplc="0415001B" w:tentative="1">
+      <w:start w:val="1"/>
+      <w:numFmt w:val="lowerRoman"/>
+      <w:lvlText w:val="%6."/>
+      <w:lvlJc w:val="right"/>
+      <w:pPr>
+        <w:ind w:left="4668" w:hanging="180"/>
+      </w:pPr>
+    </w:lvl>
+    <w:lvl w:ilvl="6" w:tplc="0415000F" w:tentative="1">
+      <w:start w:val="1"/>
+      <w:numFmt w:val="decimal"/>
+      <w:lvlText w:val="%7."/>
+      <w:lvlJc w:val="left"/>
+      <w:pPr>
+        <w:ind w:left="5388" w:hanging="360"/>
+      </w:pPr>
+    </w:lvl>
+    <w:lvl w:ilvl="7" w:tplc="04150019" w:tentative="1">
+      <w:start w:val="1"/>
+      <w:numFmt w:val="lowerLetter"/>
+      <w:lvlText w:val="%8."/>
+      <w:lvlJc w:val="left"/>
+      <w:pPr>
+        <w:ind w:left="6108" w:hanging="360"/>
+      </w:pPr>
+    </w:lvl>
+    <w:lvl w:ilvl="8" w:tplc="0415001B" w:tentative="1">
+      <w:start w:val="1"/>
+      <w:numFmt w:val="lowerRoman"/>
+      <w:lvlText w:val="%9."/>
+      <w:lvlJc w:val="right"/>
+      <w:pPr>
+        <w:ind w:left="6828" w:hanging="180"/>
+      </w:pPr>
+    </w:lvl>
+  </w:abstractNum>
+  <w:abstractNum w:abstractNumId="1" w15:restartNumberingAfterBreak="0">
+    <w:nsid w:val="0EF75DA7"/>
+    <w:multiLevelType w:val="hybridMultilevel"/>
+    <w:tmpl w:val="188ACD46"/>
+    <w:lvl w:ilvl="0" w:tplc="04150001">
+      <w:start w:val="1"/>
+      <w:numFmt w:val="bullet"/>
+      <w:lvlText w:val=""/>
+      <w:lvlJc w:val="left"/>
+      <w:pPr>
+        <w:ind w:left="720" w:hanging="360"/>
+      </w:pPr>
+      <w:rPr>
+        <w:rFonts w:ascii="Symbol" w:hAnsi="Symbol" w:hint="default"/>
+      </w:rPr>
+    </w:lvl>
+    <w:lvl w:ilvl="1" w:tplc="04150003" w:tentative="1">
+      <w:start w:val="1"/>
+      <w:numFmt w:val="bullet"/>
+      <w:lvlText w:val="o"/>
+      <w:lvlJc w:val="left"/>
+      <w:pPr>
+        <w:ind w:left="1440" w:hanging="360"/>
+      </w:pPr>
+      <w:rPr>
+        <w:rFonts w:ascii="Courier New" w:hAnsi="Courier New" w:cs="Courier New" w:hint="default"/>
+      </w:rPr>
+    </w:lvl>
+    <w:lvl w:ilvl="2" w:tplc="04150005" w:tentative="1">
+      <w:start w:val="1"/>
+      <w:numFmt w:val="bullet"/>
+      <w:lvlText w:val=""/>
+      <w:lvlJc w:val="left"/>
+      <w:pPr>
+        <w:ind w:left="2160" w:hanging="360"/>
+      </w:pPr>
+      <w:rPr>
+        <w:rFonts w:ascii="Wingdings" w:hAnsi="Wingdings" w:hint="default"/>
+      </w:rPr>
+    </w:lvl>
+    <w:lvl w:ilvl="3" w:tplc="04150001" w:tentative="1">
+      <w:start w:val="1"/>
+      <w:numFmt w:val="bullet"/>
+      <w:lvlText w:val=""/>
+      <w:lvlJc w:val="left"/>
+      <w:pPr>
+        <w:ind w:left="2880" w:hanging="360"/>
+      </w:pPr>
+      <w:rPr>
+        <w:rFonts w:ascii="Symbol" w:hAnsi="Symbol" w:hint="default"/>
+      </w:rPr>
+    </w:lvl>
+    <w:lvl w:ilvl="4" w:tplc="04150003" w:tentative="1">
+      <w:start w:val="1"/>
+      <w:numFmt w:val="bullet"/>
+      <w:lvlText w:val="o"/>
+      <w:lvlJc w:val="left"/>
+      <w:pPr>
+        <w:ind w:left="3600" w:hanging="360"/>
+      </w:pPr>
+      <w:rPr>
+        <w:rFonts w:ascii="Courier New" w:hAnsi="Courier New" w:cs="Courier New" w:hint="default"/>
+      </w:rPr>
+    </w:lvl>
+    <w:lvl w:ilvl="5" w:tplc="04150005" w:tentative="1">
+      <w:start w:val="1"/>
+      <w:numFmt w:val="bullet"/>
+      <w:lvlText w:val=""/>
+      <w:lvlJc w:val="left"/>
+      <w:pPr>
+        <w:ind w:left="4320" w:hanging="360"/>
+      </w:pPr>
+      <w:rPr>
+        <w:rFonts w:ascii="Wingdings" w:hAnsi="Wingdings" w:hint="default"/>
+      </w:rPr>
+    </w:lvl>
+    <w:lvl w:ilvl="6" w:tplc="04150001" w:tentative="1">
+      <w:start w:val="1"/>
+      <w:numFmt w:val="bullet"/>
+      <w:lvlText w:val=""/>
+      <w:lvlJc w:val="left"/>
+      <w:pPr>
+        <w:ind w:left="5040" w:hanging="360"/>
+      </w:pPr>
+      <w:rPr>
+        <w:rFonts w:ascii="Symbol" w:hAnsi="Symbol" w:hint="default"/>
+      </w:rPr>
+    </w:lvl>
+    <w:lvl w:ilvl="7" w:tplc="04150003" w:tentative="1">
+      <w:start w:val="1"/>
+      <w:numFmt w:val="bullet"/>
+      <w:lvlText w:val="o"/>
+      <w:lvlJc w:val="left"/>
+      <w:pPr>
+        <w:ind w:left="5760" w:hanging="360"/>
+      </w:pPr>
+      <w:rPr>
+        <w:rFonts w:ascii="Courier New" w:hAnsi="Courier New" w:cs="Courier New" w:hint="default"/>
+      </w:rPr>
+    </w:lvl>
+    <w:lvl w:ilvl="8" w:tplc="04150005" w:tentative="1">
+      <w:start w:val="1"/>
+      <w:numFmt w:val="bullet"/>
+      <w:lvlText w:val=""/>
+      <w:lvlJc w:val="left"/>
+      <w:pPr>
+        <w:ind w:left="6480" w:hanging="360"/>
+      </w:pPr>
+      <w:rPr>
+        <w:rFonts w:ascii="Wingdings" w:hAnsi="Wingdings" w:hint="default"/>
+      </w:rPr>
+    </w:lvl>
+  </w:abstractNum>
+  <w:abstractNum w:abstractNumId="2" w15:restartNumberingAfterBreak="0">
+    <w:nsid w:val="12F31EE3"/>
+    <w:multiLevelType w:val="hybridMultilevel"/>
+    <w:tmpl w:val="649E7146"/>
+    <w:lvl w:ilvl="0" w:tplc="04150001">
+      <w:start w:val="1"/>
+      <w:numFmt w:val="bullet"/>
+      <w:lvlText w:val=""/>
+      <w:lvlJc w:val="left"/>
+      <w:pPr>
+        <w:ind w:left="720" w:hanging="360"/>
+      </w:pPr>
+      <w:rPr>
+        <w:rFonts w:ascii="Symbol" w:hAnsi="Symbol" w:hint="default"/>
+      </w:rPr>
+    </w:lvl>
+    <w:lvl w:ilvl="1" w:tplc="04150003" w:tentative="1">
+      <w:start w:val="1"/>
+      <w:numFmt w:val="bullet"/>
+      <w:lvlText w:val="o"/>
+      <w:lvlJc w:val="left"/>
+      <w:pPr>
+        <w:ind w:left="1440" w:hanging="360"/>
+      </w:pPr>
+      <w:rPr>
+        <w:rFonts w:ascii="Courier New" w:hAnsi="Courier New" w:cs="Courier New" w:hint="default"/>
+      </w:rPr>
+    </w:lvl>
+    <w:lvl w:ilvl="2" w:tplc="04150005" w:tentative="1">
+      <w:start w:val="1"/>
+      <w:numFmt w:val="bullet"/>
+      <w:lvlText w:val=""/>
+      <w:lvlJc w:val="left"/>
+      <w:pPr>
+        <w:ind w:left="2160" w:hanging="360"/>
+      </w:pPr>
+      <w:rPr>
+        <w:rFonts w:ascii="Wingdings" w:hAnsi="Wingdings" w:hint="default"/>
+      </w:rPr>
+    </w:lvl>
+    <w:lvl w:ilvl="3" w:tplc="04150001" w:tentative="1">
+      <w:start w:val="1"/>
+      <w:numFmt w:val="bullet"/>
+      <w:lvlText w:val=""/>
+      <w:lvlJc w:val="left"/>
+      <w:pPr>
+        <w:ind w:left="2880" w:hanging="360"/>
+      </w:pPr>
+      <w:rPr>
+        <w:rFonts w:ascii="Symbol" w:hAnsi="Symbol" w:hint="default"/>
+      </w:rPr>
+    </w:lvl>
+    <w:lvl w:ilvl="4" w:tplc="04150003" w:tentative="1">
+      <w:start w:val="1"/>
+      <w:numFmt w:val="bullet"/>
+      <w:lvlText w:val="o"/>
+      <w:lvlJc w:val="left"/>
+      <w:pPr>
+        <w:ind w:left="3600" w:hanging="360"/>
+      </w:pPr>
+      <w:rPr>
+        <w:rFonts w:ascii="Courier New" w:hAnsi="Courier New" w:cs="Courier New" w:hint="default"/>
+      </w:rPr>
+    </w:lvl>
+    <w:lvl w:ilvl="5" w:tplc="04150005" w:tentative="1">
+      <w:start w:val="1"/>
+      <w:numFmt w:val="bullet"/>
+      <w:lvlText w:val=""/>
+      <w:lvlJc w:val="left"/>
+      <w:pPr>
+        <w:ind w:left="4320" w:hanging="360"/>
+      </w:pPr>
+      <w:rPr>
+        <w:rFonts w:ascii="Wingdings" w:hAnsi="Wingdings" w:hint="default"/>
+      </w:rPr>
+    </w:lvl>
+    <w:lvl w:ilvl="6" w:tplc="04150001" w:tentative="1">
+      <w:start w:val="1"/>
+      <w:numFmt w:val="bullet"/>
+      <w:lvlText w:val=""/>
+      <w:lvlJc w:val="left"/>
+      <w:pPr>
+        <w:ind w:left="5040" w:hanging="360"/>
+      </w:pPr>
+      <w:rPr>
+        <w:rFonts w:ascii="Symbol" w:hAnsi="Symbol" w:hint="default"/>
+      </w:rPr>
+    </w:lvl>
+    <w:lvl w:ilvl="7" w:tplc="04150003" w:tentative="1">
+      <w:start w:val="1"/>
+      <w:numFmt w:val="bullet"/>
+      <w:lvlText w:val="o"/>
+      <w:lvlJc w:val="left"/>
+      <w:pPr>
+        <w:ind w:left="5760" w:hanging="360"/>
+      </w:pPr>
+      <w:rPr>
+        <w:rFonts w:ascii="Courier New" w:hAnsi="Courier New" w:cs="Courier New" w:hint="default"/>
+      </w:rPr>
+    </w:lvl>
+    <w:lvl w:ilvl="8" w:tplc="04150005" w:tentative="1">
+      <w:start w:val="1"/>
+      <w:numFmt w:val="bullet"/>
+      <w:lvlText w:val=""/>
+      <w:lvlJc w:val="left"/>
+      <w:pPr>
+        <w:ind w:left="6480" w:hanging="360"/>
+      </w:pPr>
+      <w:rPr>
+        <w:rFonts w:ascii="Wingdings" w:hAnsi="Wingdings" w:hint="default"/>
+      </w:rPr>
+    </w:lvl>
+  </w:abstractNum>
+  <w:abstractNum w:abstractNumId="3" w15:restartNumberingAfterBreak="0">
     <w:nsid w:val="310F4D64"/>
     <w:multiLevelType w:val="multilevel"/>
     <w:tmpl w:val="7252367C"/>
@@ -1297,7 +1699,233 @@
       </w:rPr>
     </w:lvl>
   </w:abstractNum>
-  <w:abstractNum w:abstractNumId="1" w15:restartNumberingAfterBreak="0">
+  <w:abstractNum w:abstractNumId="4" w15:restartNumberingAfterBreak="0">
+    <w:nsid w:val="399717A5"/>
+    <w:multiLevelType w:val="hybridMultilevel"/>
+    <w:tmpl w:val="84C2ACF6"/>
+    <w:lvl w:ilvl="0" w:tplc="04150001">
+      <w:start w:val="1"/>
+      <w:numFmt w:val="bullet"/>
+      <w:lvlText w:val=""/>
+      <w:lvlJc w:val="left"/>
+      <w:pPr>
+        <w:ind w:left="720" w:hanging="360"/>
+      </w:pPr>
+      <w:rPr>
+        <w:rFonts w:ascii="Symbol" w:hAnsi="Symbol" w:hint="default"/>
+      </w:rPr>
+    </w:lvl>
+    <w:lvl w:ilvl="1" w:tplc="04150003" w:tentative="1">
+      <w:start w:val="1"/>
+      <w:numFmt w:val="bullet"/>
+      <w:lvlText w:val="o"/>
+      <w:lvlJc w:val="left"/>
+      <w:pPr>
+        <w:ind w:left="1440" w:hanging="360"/>
+      </w:pPr>
+      <w:rPr>
+        <w:rFonts w:ascii="Courier New" w:hAnsi="Courier New" w:cs="Courier New" w:hint="default"/>
+      </w:rPr>
+    </w:lvl>
+    <w:lvl w:ilvl="2" w:tplc="04150005" w:tentative="1">
+      <w:start w:val="1"/>
+      <w:numFmt w:val="bullet"/>
+      <w:lvlText w:val=""/>
+      <w:lvlJc w:val="left"/>
+      <w:pPr>
+        <w:ind w:left="2160" w:hanging="360"/>
+      </w:pPr>
+      <w:rPr>
+        <w:rFonts w:ascii="Wingdings" w:hAnsi="Wingdings" w:hint="default"/>
+      </w:rPr>
+    </w:lvl>
+    <w:lvl w:ilvl="3" w:tplc="04150001" w:tentative="1">
+      <w:start w:val="1"/>
+      <w:numFmt w:val="bullet"/>
+      <w:lvlText w:val=""/>
+      <w:lvlJc w:val="left"/>
+      <w:pPr>
+        <w:ind w:left="2880" w:hanging="360"/>
+      </w:pPr>
+      <w:rPr>
+        <w:rFonts w:ascii="Symbol" w:hAnsi="Symbol" w:hint="default"/>
+      </w:rPr>
+    </w:lvl>
+    <w:lvl w:ilvl="4" w:tplc="04150003" w:tentative="1">
+      <w:start w:val="1"/>
+      <w:numFmt w:val="bullet"/>
+      <w:lvlText w:val="o"/>
+      <w:lvlJc w:val="left"/>
+      <w:pPr>
+        <w:ind w:left="3600" w:hanging="360"/>
+      </w:pPr>
+      <w:rPr>
+        <w:rFonts w:ascii="Courier New" w:hAnsi="Courier New" w:cs="Courier New" w:hint="default"/>
+      </w:rPr>
+    </w:lvl>
+    <w:lvl w:ilvl="5" w:tplc="04150005" w:tentative="1">
+      <w:start w:val="1"/>
+      <w:numFmt w:val="bullet"/>
+      <w:lvlText w:val=""/>
+      <w:lvlJc w:val="left"/>
+      <w:pPr>
+        <w:ind w:left="4320" w:hanging="360"/>
+      </w:pPr>
+      <w:rPr>
+        <w:rFonts w:ascii="Wingdings" w:hAnsi="Wingdings" w:hint="default"/>
+      </w:rPr>
+    </w:lvl>
+    <w:lvl w:ilvl="6" w:tplc="04150001" w:tentative="1">
+      <w:start w:val="1"/>
+      <w:numFmt w:val="bullet"/>
+      <w:lvlText w:val=""/>
+      <w:lvlJc w:val="left"/>
+      <w:pPr>
+        <w:ind w:left="5040" w:hanging="360"/>
+      </w:pPr>
+      <w:rPr>
+        <w:rFonts w:ascii="Symbol" w:hAnsi="Symbol" w:hint="default"/>
+      </w:rPr>
+    </w:lvl>
+    <w:lvl w:ilvl="7" w:tplc="04150003" w:tentative="1">
+      <w:start w:val="1"/>
+      <w:numFmt w:val="bullet"/>
+      <w:lvlText w:val="o"/>
+      <w:lvlJc w:val="left"/>
+      <w:pPr>
+        <w:ind w:left="5760" w:hanging="360"/>
+      </w:pPr>
+      <w:rPr>
+        <w:rFonts w:ascii="Courier New" w:hAnsi="Courier New" w:cs="Courier New" w:hint="default"/>
+      </w:rPr>
+    </w:lvl>
+    <w:lvl w:ilvl="8" w:tplc="04150005" w:tentative="1">
+      <w:start w:val="1"/>
+      <w:numFmt w:val="bullet"/>
+      <w:lvlText w:val=""/>
+      <w:lvlJc w:val="left"/>
+      <w:pPr>
+        <w:ind w:left="6480" w:hanging="360"/>
+      </w:pPr>
+      <w:rPr>
+        <w:rFonts w:ascii="Wingdings" w:hAnsi="Wingdings" w:hint="default"/>
+      </w:rPr>
+    </w:lvl>
+  </w:abstractNum>
+  <w:abstractNum w:abstractNumId="5" w15:restartNumberingAfterBreak="0">
+    <w:nsid w:val="472D3C70"/>
+    <w:multiLevelType w:val="hybridMultilevel"/>
+    <w:tmpl w:val="B1360DB6"/>
+    <w:lvl w:ilvl="0" w:tplc="04150001">
+      <w:start w:val="1"/>
+      <w:numFmt w:val="bullet"/>
+      <w:lvlText w:val=""/>
+      <w:lvlJc w:val="left"/>
+      <w:pPr>
+        <w:ind w:left="720" w:hanging="360"/>
+      </w:pPr>
+      <w:rPr>
+        <w:rFonts w:ascii="Symbol" w:hAnsi="Symbol" w:hint="default"/>
+      </w:rPr>
+    </w:lvl>
+    <w:lvl w:ilvl="1" w:tplc="04150003" w:tentative="1">
+      <w:start w:val="1"/>
+      <w:numFmt w:val="bullet"/>
+      <w:lvlText w:val="o"/>
+      <w:lvlJc w:val="left"/>
+      <w:pPr>
+        <w:ind w:left="1440" w:hanging="360"/>
+      </w:pPr>
+      <w:rPr>
+        <w:rFonts w:ascii="Courier New" w:hAnsi="Courier New" w:cs="Courier New" w:hint="default"/>
+      </w:rPr>
+    </w:lvl>
+    <w:lvl w:ilvl="2" w:tplc="04150005" w:tentative="1">
+      <w:start w:val="1"/>
+      <w:numFmt w:val="bullet"/>
+      <w:lvlText w:val=""/>
+      <w:lvlJc w:val="left"/>
+      <w:pPr>
+        <w:ind w:left="2160" w:hanging="360"/>
+      </w:pPr>
+      <w:rPr>
+        <w:rFonts w:ascii="Wingdings" w:hAnsi="Wingdings" w:hint="default"/>
+      </w:rPr>
+    </w:lvl>
+    <w:lvl w:ilvl="3" w:tplc="04150001" w:tentative="1">
+      <w:start w:val="1"/>
+      <w:numFmt w:val="bullet"/>
+      <w:lvlText w:val=""/>
+      <w:lvlJc w:val="left"/>
+      <w:pPr>
+        <w:ind w:left="2880" w:hanging="360"/>
+      </w:pPr>
+      <w:rPr>
+        <w:rFonts w:ascii="Symbol" w:hAnsi="Symbol" w:hint="default"/>
+      </w:rPr>
+    </w:lvl>
+    <w:lvl w:ilvl="4" w:tplc="04150003" w:tentative="1">
+      <w:start w:val="1"/>
+      <w:numFmt w:val="bullet"/>
+      <w:lvlText w:val="o"/>
+      <w:lvlJc w:val="left"/>
+      <w:pPr>
+        <w:ind w:left="3600" w:hanging="360"/>
+      </w:pPr>
+      <w:rPr>
+        <w:rFonts w:ascii="Courier New" w:hAnsi="Courier New" w:cs="Courier New" w:hint="default"/>
+      </w:rPr>
+    </w:lvl>
+    <w:lvl w:ilvl="5" w:tplc="04150005" w:tentative="1">
+      <w:start w:val="1"/>
+      <w:numFmt w:val="bullet"/>
+      <w:lvlText w:val=""/>
+      <w:lvlJc w:val="left"/>
+      <w:pPr>
+        <w:ind w:left="4320" w:hanging="360"/>
+      </w:pPr>
+      <w:rPr>
+        <w:rFonts w:ascii="Wingdings" w:hAnsi="Wingdings" w:hint="default"/>
+      </w:rPr>
+    </w:lvl>
+    <w:lvl w:ilvl="6" w:tplc="04150001" w:tentative="1">
+      <w:start w:val="1"/>
+      <w:numFmt w:val="bullet"/>
+      <w:lvlText w:val=""/>
+      <w:lvlJc w:val="left"/>
+      <w:pPr>
+        <w:ind w:left="5040" w:hanging="360"/>
+      </w:pPr>
+      <w:rPr>
+        <w:rFonts w:ascii="Symbol" w:hAnsi="Symbol" w:hint="default"/>
+      </w:rPr>
+    </w:lvl>
+    <w:lvl w:ilvl="7" w:tplc="04150003" w:tentative="1">
+      <w:start w:val="1"/>
+      <w:numFmt w:val="bullet"/>
+      <w:lvlText w:val="o"/>
+      <w:lvlJc w:val="left"/>
+      <w:pPr>
+        <w:ind w:left="5760" w:hanging="360"/>
+      </w:pPr>
+      <w:rPr>
+        <w:rFonts w:ascii="Courier New" w:hAnsi="Courier New" w:cs="Courier New" w:hint="default"/>
+      </w:rPr>
+    </w:lvl>
+    <w:lvl w:ilvl="8" w:tplc="04150005" w:tentative="1">
+      <w:start w:val="1"/>
+      <w:numFmt w:val="bullet"/>
+      <w:lvlText w:val=""/>
+      <w:lvlJc w:val="left"/>
+      <w:pPr>
+        <w:ind w:left="6480" w:hanging="360"/>
+      </w:pPr>
+      <w:rPr>
+        <w:rFonts w:ascii="Wingdings" w:hAnsi="Wingdings" w:hint="default"/>
+      </w:rPr>
+    </w:lvl>
+  </w:abstractNum>
+  <w:abstractNum w:abstractNumId="6" w15:restartNumberingAfterBreak="0">
     <w:nsid w:val="48B35213"/>
     <w:multiLevelType w:val="multilevel"/>
     <w:tmpl w:val="B32ACFE8"/>
@@ -1446,7 +2074,96 @@
       </w:rPr>
     </w:lvl>
   </w:abstractNum>
-  <w:abstractNum w:abstractNumId="2" w15:restartNumberingAfterBreak="0">
+  <w:abstractNum w:abstractNumId="7" w15:restartNumberingAfterBreak="0">
+    <w:nsid w:val="4D5B61EE"/>
+    <w:multiLevelType w:val="hybridMultilevel"/>
+    <w:tmpl w:val="9320A148"/>
+    <w:lvl w:ilvl="0" w:tplc="0415000F">
+      <w:start w:val="1"/>
+      <w:numFmt w:val="decimal"/>
+      <w:lvlText w:val="%1."/>
+      <w:lvlJc w:val="left"/>
+      <w:pPr>
+        <w:ind w:left="720" w:hanging="360"/>
+      </w:pPr>
+      <w:rPr>
+        <w:rFonts w:hint="default"/>
+      </w:rPr>
+    </w:lvl>
+    <w:lvl w:ilvl="1" w:tplc="04150019" w:tentative="1">
+      <w:start w:val="1"/>
+      <w:numFmt w:val="lowerLetter"/>
+      <w:lvlText w:val="%2."/>
+      <w:lvlJc w:val="left"/>
+      <w:pPr>
+        <w:ind w:left="1440" w:hanging="360"/>
+      </w:pPr>
+    </w:lvl>
+    <w:lvl w:ilvl="2" w:tplc="0415001B" w:tentative="1">
+      <w:start w:val="1"/>
+      <w:numFmt w:val="lowerRoman"/>
+      <w:lvlText w:val="%3."/>
+      <w:lvlJc w:val="right"/>
+      <w:pPr>
+        <w:ind w:left="2160" w:hanging="180"/>
+      </w:pPr>
+    </w:lvl>
+    <w:lvl w:ilvl="3" w:tplc="0415000F" w:tentative="1">
+      <w:start w:val="1"/>
+      <w:numFmt w:val="decimal"/>
+      <w:lvlText w:val="%4."/>
+      <w:lvlJc w:val="left"/>
+      <w:pPr>
+        <w:ind w:left="2880" w:hanging="360"/>
+      </w:pPr>
+    </w:lvl>
+    <w:lvl w:ilvl="4" w:tplc="04150019" w:tentative="1">
+      <w:start w:val="1"/>
+      <w:numFmt w:val="lowerLetter"/>
+      <w:lvlText w:val="%5."/>
+      <w:lvlJc w:val="left"/>
+      <w:pPr>
+        <w:ind w:left="3600" w:hanging="360"/>
+      </w:pPr>
+    </w:lvl>
+    <w:lvl w:ilvl="5" w:tplc="0415001B" w:tentative="1">
+      <w:start w:val="1"/>
+      <w:numFmt w:val="lowerRoman"/>
+      <w:lvlText w:val="%6."/>
+      <w:lvlJc w:val="right"/>
+      <w:pPr>
+        <w:ind w:left="4320" w:hanging="180"/>
+      </w:pPr>
+    </w:lvl>
+    <w:lvl w:ilvl="6" w:tplc="0415000F" w:tentative="1">
+      <w:start w:val="1"/>
+      <w:numFmt w:val="decimal"/>
+      <w:lvlText w:val="%7."/>
+      <w:lvlJc w:val="left"/>
+      <w:pPr>
+        <w:ind w:left="5040" w:hanging="360"/>
+      </w:pPr>
+    </w:lvl>
+    <w:lvl w:ilvl="7" w:tplc="04150019" w:tentative="1">
+      <w:start w:val="1"/>
+      <w:numFmt w:val="lowerLetter"/>
+      <w:lvlText w:val="%8."/>
+      <w:lvlJc w:val="left"/>
+      <w:pPr>
+        <w:ind w:left="5760" w:hanging="360"/>
+      </w:pPr>
+    </w:lvl>
+    <w:lvl w:ilvl="8" w:tplc="0415001B" w:tentative="1">
+      <w:start w:val="1"/>
+      <w:numFmt w:val="lowerRoman"/>
+      <w:lvlText w:val="%9."/>
+      <w:lvlJc w:val="right"/>
+      <w:pPr>
+        <w:ind w:left="6480" w:hanging="180"/>
+      </w:pPr>
+    </w:lvl>
+  </w:abstractNum>
+  <w:abstractNum w:abstractNumId="8" w15:restartNumberingAfterBreak="0">
     <w:nsid w:val="54C7211C"/>
     <w:multiLevelType w:val="multilevel"/>
     <w:tmpl w:val="D2CA2E2C"/>
@@ -1596,13 +2313,31 @@
     </w:lvl>
   </w:abstractNum>
   <w:num w:numId="1" w16cid:durableId="1209873041">
+    <w:abstractNumId w:val="6"/>
+  </w:num>
+  <w:num w:numId="2" w16cid:durableId="1524709584">
+    <w:abstractNumId w:val="3"/>
+  </w:num>
+  <w:num w:numId="3" w16cid:durableId="1471678760">
+    <w:abstractNumId w:val="8"/>
+  </w:num>
+  <w:num w:numId="4" w16cid:durableId="797532479">
+    <w:abstractNumId w:val="0"/>
+  </w:num>
+  <w:num w:numId="5" w16cid:durableId="247857538">
+    <w:abstractNumId w:val="2"/>
+  </w:num>
+  <w:num w:numId="6" w16cid:durableId="1900247276">
+    <w:abstractNumId w:val="7"/>
+  </w:num>
+  <w:num w:numId="7" w16cid:durableId="1464806332">
     <w:abstractNumId w:val="1"/>
   </w:num>
-  <w:num w:numId="2" w16cid:durableId="1524709584">
-    <w:abstractNumId w:val="0"/>
+  <w:num w:numId="8" w16cid:durableId="1067608836">
+    <w:abstractNumId w:val="5"/>
   </w:num>
-  <w:num w:numId="3" w16cid:durableId="1471678760">
-    <w:abstractNumId w:val="2"/>
+  <w:num w:numId="9" w16cid:durableId="1667131356">
+    <w:abstractNumId w:val="4"/>
   </w:num>
 </w:numbering>
 </file>

</xml_diff>

<commit_message>
Update app text and project documentation
</commit_message>
<xml_diff>
--- a/docs/Dokumentacja.docx
+++ b/docs/Dokumentacja.docx
@@ -13,6 +13,7 @@
           <w:szCs w:val="24"/>
         </w:rPr>
       </w:pPr>
+      <w:proofErr w:type="spellStart"/>
       <w:r>
         <w:rPr>
           <w:rFonts w:ascii="Times New Roman" w:hAnsi="Times New Roman" w:cs="Times New Roman"/>
@@ -21,11 +22,10 @@
           <w:sz w:val="24"/>
           <w:szCs w:val="24"/>
         </w:rPr>
-        <w:t>CreditCheck – dokumentacja projektu</w:t>
-      </w:r>
-    </w:p>
-    <w:p>
-      <w:pPr>
+        <w:t>CreditCheck</w:t>
+      </w:r>
+      <w:proofErr w:type="spellEnd"/>
+      <w:r>
         <w:rPr>
           <w:rFonts w:ascii="Times New Roman" w:hAnsi="Times New Roman" w:cs="Times New Roman"/>
           <w:b/>
@@ -33,8 +33,11 @@
           <w:sz w:val="24"/>
           <w:szCs w:val="24"/>
         </w:rPr>
-      </w:pPr>
-      <w:r>
+        <w:t xml:space="preserve"> – dokumentacja projektu</w:t>
+      </w:r>
+    </w:p>
+    <w:p>
+      <w:pPr>
         <w:rPr>
           <w:rFonts w:ascii="Times New Roman" w:hAnsi="Times New Roman" w:cs="Times New Roman"/>
           <w:b/>
@@ -42,92 +45,8 @@
           <w:sz w:val="24"/>
           <w:szCs w:val="24"/>
         </w:rPr>
-        <w:t>Opis aplikacji</w:t>
-      </w:r>
-    </w:p>
-    <w:p>
-      <w:pPr>
-        <w:rPr>
-          <w:rFonts w:ascii="Times New Roman" w:hAnsi="Times New Roman" w:cs="Times New Roman"/>
-          <w:sz w:val="24"/>
-          <w:szCs w:val="24"/>
-        </w:rPr>
-      </w:pPr>
-      <w:r>
-        <w:rPr>
-          <w:rFonts w:ascii="Times New Roman" w:hAnsi="Times New Roman" w:cs="Times New Roman"/>
-          <w:sz w:val="24"/>
-          <w:szCs w:val="24"/>
-        </w:rPr>
-        <w:t>CreditCheck to lokalna aplikacja webowa wspierająca wstępną ocenę szans na</w:t>
-      </w:r>
-      <w:r>
-        <w:rPr>
-          <w:rFonts w:ascii="Times New Roman" w:hAnsi="Times New Roman" w:cs="Times New Roman"/>
-          <w:sz w:val="24"/>
-          <w:szCs w:val="24"/>
-        </w:rPr>
-        <w:t xml:space="preserve"> </w:t>
-      </w:r>
-      <w:r>
-        <w:rPr>
-          <w:rFonts w:ascii="Times New Roman" w:hAnsi="Times New Roman" w:cs="Times New Roman"/>
-          <w:sz w:val="24"/>
-          <w:szCs w:val="24"/>
-        </w:rPr>
-        <w:t>uzyskanie</w:t>
-      </w:r>
-      <w:r>
-        <w:rPr>
-          <w:rFonts w:ascii="Times New Roman" w:hAnsi="Times New Roman" w:cs="Times New Roman"/>
-          <w:sz w:val="24"/>
-          <w:szCs w:val="24"/>
-        </w:rPr>
-        <w:t xml:space="preserve"> </w:t>
-      </w:r>
-      <w:r>
-        <w:rPr>
-          <w:rFonts w:ascii="Times New Roman" w:hAnsi="Times New Roman" w:cs="Times New Roman"/>
-          <w:sz w:val="24"/>
-          <w:szCs w:val="24"/>
-        </w:rPr>
-        <w:t>kredytu. Użytkownik uzupełnia formularz, a aplikacja przedstawia</w:t>
-      </w:r>
-      <w:r>
-        <w:rPr>
-          <w:rFonts w:ascii="Times New Roman" w:hAnsi="Times New Roman" w:cs="Times New Roman"/>
-          <w:sz w:val="24"/>
-          <w:szCs w:val="24"/>
-        </w:rPr>
-        <w:t xml:space="preserve"> </w:t>
-      </w:r>
-      <w:r>
-        <w:rPr>
-          <w:rFonts w:ascii="Times New Roman" w:hAnsi="Times New Roman" w:cs="Times New Roman"/>
-          <w:sz w:val="24"/>
-          <w:szCs w:val="24"/>
-        </w:rPr>
-        <w:t>przewidywaną decyzję modelu, prawdopodobieństwo akceptacji oraz komentarz do</w:t>
-      </w:r>
-      <w:r>
-        <w:rPr>
-          <w:rFonts w:ascii="Times New Roman" w:hAnsi="Times New Roman" w:cs="Times New Roman"/>
-          <w:sz w:val="24"/>
-          <w:szCs w:val="24"/>
-        </w:rPr>
-        <w:t xml:space="preserve"> </w:t>
-      </w:r>
-      <w:r>
-        <w:rPr>
-          <w:rFonts w:ascii="Times New Roman" w:hAnsi="Times New Roman" w:cs="Times New Roman"/>
-          <w:sz w:val="24"/>
-          <w:szCs w:val="24"/>
-        </w:rPr>
-        <w:t>podanych danych.</w:t>
-      </w:r>
-    </w:p>
-    <w:p>
-      <w:pPr>
+      </w:pPr>
+      <w:r>
         <w:rPr>
           <w:rFonts w:ascii="Times New Roman" w:hAnsi="Times New Roman" w:cs="Times New Roman"/>
           <w:b/>
@@ -135,57 +54,112 @@
           <w:sz w:val="24"/>
           <w:szCs w:val="24"/>
         </w:rPr>
-      </w:pPr>
-      <w:r>
+        <w:t>Opis aplikacji</w:t>
+      </w:r>
+    </w:p>
+    <w:p>
+      <w:pPr>
+        <w:rPr>
+          <w:rFonts w:ascii="Times New Roman" w:hAnsi="Times New Roman" w:cs="Times New Roman"/>
+          <w:sz w:val="24"/>
+          <w:szCs w:val="24"/>
+        </w:rPr>
+      </w:pPr>
+      <w:proofErr w:type="spellStart"/>
+      <w:r>
+        <w:rPr>
+          <w:rFonts w:ascii="Times New Roman" w:hAnsi="Times New Roman" w:cs="Times New Roman"/>
+          <w:sz w:val="24"/>
+          <w:szCs w:val="24"/>
+        </w:rPr>
+        <w:t>CreditCheck</w:t>
+      </w:r>
+      <w:proofErr w:type="spellEnd"/>
+      <w:r>
+        <w:rPr>
+          <w:rFonts w:ascii="Times New Roman" w:hAnsi="Times New Roman" w:cs="Times New Roman"/>
+          <w:sz w:val="24"/>
+          <w:szCs w:val="24"/>
+        </w:rPr>
+        <w:t xml:space="preserve"> to lokalna aplikacja webowa wspierająca wstępną ocenę szans na</w:t>
+      </w:r>
+      <w:r>
+        <w:rPr>
+          <w:rFonts w:ascii="Times New Roman" w:hAnsi="Times New Roman" w:cs="Times New Roman"/>
+          <w:sz w:val="24"/>
+          <w:szCs w:val="24"/>
+        </w:rPr>
+        <w:t xml:space="preserve"> </w:t>
+      </w:r>
+      <w:r>
+        <w:rPr>
+          <w:rFonts w:ascii="Times New Roman" w:hAnsi="Times New Roman" w:cs="Times New Roman"/>
+          <w:sz w:val="24"/>
+          <w:szCs w:val="24"/>
+        </w:rPr>
+        <w:t>uzyskanie</w:t>
+      </w:r>
+      <w:r>
+        <w:rPr>
+          <w:rFonts w:ascii="Times New Roman" w:hAnsi="Times New Roman" w:cs="Times New Roman"/>
+          <w:sz w:val="24"/>
+          <w:szCs w:val="24"/>
+        </w:rPr>
+        <w:t xml:space="preserve"> </w:t>
+      </w:r>
+      <w:r>
+        <w:rPr>
+          <w:rFonts w:ascii="Times New Roman" w:hAnsi="Times New Roman" w:cs="Times New Roman"/>
+          <w:sz w:val="24"/>
+          <w:szCs w:val="24"/>
+        </w:rPr>
+        <w:t>kredytu. Użytkownik uzupełnia formularz, a aplikacja przedstawia</w:t>
+      </w:r>
+      <w:r>
+        <w:rPr>
+          <w:rFonts w:ascii="Times New Roman" w:hAnsi="Times New Roman" w:cs="Times New Roman"/>
+          <w:sz w:val="24"/>
+          <w:szCs w:val="24"/>
+        </w:rPr>
+        <w:t xml:space="preserve"> </w:t>
+      </w:r>
+      <w:r>
+        <w:rPr>
+          <w:rFonts w:ascii="Times New Roman" w:hAnsi="Times New Roman" w:cs="Times New Roman"/>
+          <w:sz w:val="24"/>
+          <w:szCs w:val="24"/>
+        </w:rPr>
+        <w:t>przewidywaną decyzję modelu, prawdopodobieństwo akceptacji oraz komentarz do</w:t>
+      </w:r>
+      <w:r>
+        <w:rPr>
+          <w:rFonts w:ascii="Times New Roman" w:hAnsi="Times New Roman" w:cs="Times New Roman"/>
+          <w:sz w:val="24"/>
+          <w:szCs w:val="24"/>
+        </w:rPr>
+        <w:t xml:space="preserve"> </w:t>
+      </w:r>
+      <w:r>
+        <w:rPr>
+          <w:rFonts w:ascii="Times New Roman" w:hAnsi="Times New Roman" w:cs="Times New Roman"/>
+          <w:sz w:val="24"/>
+          <w:szCs w:val="24"/>
+        </w:rPr>
+        <w:t>podanych danych.</w:t>
+      </w:r>
+    </w:p>
+    <w:p>
+      <w:pPr>
         <w:rPr>
           <w:rFonts w:ascii="Times New Roman" w:hAnsi="Times New Roman" w:cs="Times New Roman"/>
           <w:b/>
           <w:bCs/>
           <w:sz w:val="24"/>
           <w:szCs w:val="24"/>
-        </w:rPr>
-        <w:t>Dataset</w:t>
-      </w:r>
-    </w:p>
-    <w:p>
-      <w:pPr>
-        <w:rPr>
-          <w:rFonts w:ascii="Times New Roman" w:hAnsi="Times New Roman" w:cs="Times New Roman"/>
-          <w:sz w:val="24"/>
-          <w:szCs w:val="24"/>
           <w:lang w:val="en-US"/>
         </w:rPr>
       </w:pPr>
       <w:r>
-        <w:rPr>
-          <w:rFonts w:ascii="Times New Roman" w:hAnsi="Times New Roman" w:cs="Times New Roman"/>
-          <w:sz w:val="24"/>
-          <w:szCs w:val="24"/>
-          <w:lang w:val="en-US"/>
-        </w:rPr>
-        <w:t>Loan Prediction Dataset (Kaggle)</w:t>
-      </w:r>
-      <w:r>
-        <w:rPr>
-          <w:rFonts w:ascii="Times New Roman" w:hAnsi="Times New Roman" w:cs="Times New Roman"/>
-          <w:sz w:val="24"/>
-          <w:szCs w:val="24"/>
-          <w:lang w:val="en-US"/>
-        </w:rPr>
-        <w:br/>
-      </w:r>
-      <w:r>
-        <w:rPr>
-          <w:rFonts w:ascii="Times New Roman" w:hAnsi="Times New Roman" w:cs="Times New Roman"/>
-          <w:sz w:val="24"/>
-          <w:szCs w:val="24"/>
-          <w:lang w:val="en-US"/>
-        </w:rPr>
-        <w:t>do uzupelnieina</w:t>
-      </w:r>
-    </w:p>
-    <w:p>
-      <w:pPr>
         <w:rPr>
           <w:rFonts w:ascii="Times New Roman" w:hAnsi="Times New Roman" w:cs="Times New Roman"/>
           <w:b/>
@@ -194,15 +168,74 @@
           <w:szCs w:val="24"/>
           <w:lang w:val="en-US"/>
         </w:rPr>
-      </w:pPr>
-      <w:r>
+        <w:t>Dataset</w:t>
+      </w:r>
+    </w:p>
+    <w:p>
+      <w:pPr>
+        <w:rPr>
+          <w:rFonts w:ascii="Times New Roman" w:hAnsi="Times New Roman" w:cs="Times New Roman"/>
+          <w:sz w:val="24"/>
+          <w:szCs w:val="24"/>
+          <w:lang w:val="en-US"/>
+        </w:rPr>
+      </w:pPr>
+      <w:r>
+        <w:rPr>
+          <w:rFonts w:ascii="Times New Roman" w:hAnsi="Times New Roman" w:cs="Times New Roman"/>
+          <w:sz w:val="24"/>
+          <w:szCs w:val="24"/>
+          <w:lang w:val="en-US"/>
+        </w:rPr>
+        <w:t>Loan Prediction Dataset (Kaggle)</w:t>
+      </w:r>
+      <w:r>
+        <w:rPr>
+          <w:rFonts w:ascii="Times New Roman" w:hAnsi="Times New Roman" w:cs="Times New Roman"/>
+          <w:sz w:val="24"/>
+          <w:szCs w:val="24"/>
+          <w:lang w:val="en-US"/>
+        </w:rPr>
+        <w:br/>
+      </w:r>
+      <w:r>
+        <w:rPr>
+          <w:rFonts w:ascii="Times New Roman" w:hAnsi="Times New Roman" w:cs="Times New Roman"/>
+          <w:sz w:val="24"/>
+          <w:szCs w:val="24"/>
+          <w:lang w:val="en-US"/>
+        </w:rPr>
+        <w:t xml:space="preserve">do </w:t>
+      </w:r>
+      <w:proofErr w:type="spellStart"/>
+      <w:r>
+        <w:rPr>
+          <w:rFonts w:ascii="Times New Roman" w:hAnsi="Times New Roman" w:cs="Times New Roman"/>
+          <w:sz w:val="24"/>
+          <w:szCs w:val="24"/>
+          <w:lang w:val="en-US"/>
+        </w:rPr>
+        <w:t>uzupełnienia</w:t>
+      </w:r>
+      <w:proofErr w:type="spellEnd"/>
+    </w:p>
+    <w:p>
+      <w:pPr>
         <w:rPr>
           <w:rFonts w:ascii="Times New Roman" w:hAnsi="Times New Roman" w:cs="Times New Roman"/>
           <w:b/>
           <w:bCs/>
           <w:sz w:val="24"/>
           <w:szCs w:val="24"/>
-          <w:lang w:val="en-US"/>
+        </w:rPr>
+      </w:pPr>
+      <w:r>
+        <w:rPr>
+          <w:rFonts w:ascii="Times New Roman" w:hAnsi="Times New Roman" w:cs="Times New Roman"/>
+          <w:b/>
+          <w:bCs/>
+          <w:sz w:val="24"/>
+          <w:szCs w:val="24"/>
         </w:rPr>
         <w:t>Model</w:t>
       </w:r>
@@ -349,7 +382,25 @@
           <w:sz w:val="24"/>
           <w:szCs w:val="24"/>
         </w:rPr>
-        <w:t>sprawdzi wersję Pythona,</w:t>
+        <w:t xml:space="preserve">sprawdzi wersję </w:t>
+      </w:r>
+      <w:proofErr w:type="spellStart"/>
+      <w:r>
+        <w:rPr>
+          <w:rFonts w:ascii="Times New Roman" w:hAnsi="Times New Roman" w:cs="Times New Roman"/>
+          <w:sz w:val="24"/>
+          <w:szCs w:val="24"/>
+        </w:rPr>
+        <w:t>Pythona</w:t>
+      </w:r>
+      <w:proofErr w:type="spellEnd"/>
+      <w:r>
+        <w:rPr>
+          <w:rFonts w:ascii="Times New Roman" w:hAnsi="Times New Roman" w:cs="Times New Roman"/>
+          <w:sz w:val="24"/>
+          <w:szCs w:val="24"/>
+        </w:rPr>
+        <w:t>,</w:t>
       </w:r>
     </w:p>
     <w:p>
@@ -367,7 +418,25 @@
           <w:sz w:val="24"/>
           <w:szCs w:val="24"/>
         </w:rPr>
-        <w:t>- utworzy lokalne środowisko `.venv`,</w:t>
+        <w:t>- utworzy lokalne środowisko `.</w:t>
+      </w:r>
+      <w:proofErr w:type="spellStart"/>
+      <w:r>
+        <w:rPr>
+          <w:rFonts w:ascii="Times New Roman" w:hAnsi="Times New Roman" w:cs="Times New Roman"/>
+          <w:sz w:val="24"/>
+          <w:szCs w:val="24"/>
+        </w:rPr>
+        <w:t>venv</w:t>
+      </w:r>
+      <w:proofErr w:type="spellEnd"/>
+      <w:r>
+        <w:rPr>
+          <w:rFonts w:ascii="Times New Roman" w:hAnsi="Times New Roman" w:cs="Times New Roman"/>
+          <w:sz w:val="24"/>
+          <w:szCs w:val="24"/>
+        </w:rPr>
+        <w:t>`,</w:t>
       </w:r>
     </w:p>
     <w:p>
@@ -433,23 +502,7 @@
           <w:sz w:val="24"/>
           <w:szCs w:val="24"/>
         </w:rPr>
-        <w:t>Aplikacja otworzy się w przeglądarce pod adresem</w:t>
-      </w:r>
-      <w:r>
-        <w:rPr>
-          <w:rFonts w:ascii="Times New Roman" w:hAnsi="Times New Roman" w:cs="Times New Roman"/>
-          <w:sz w:val="24"/>
-          <w:szCs w:val="24"/>
-        </w:rPr>
-        <w:t xml:space="preserve"> </w:t>
-      </w:r>
-      <w:r>
-        <w:rPr>
-          <w:rFonts w:ascii="Times New Roman" w:hAnsi="Times New Roman" w:cs="Times New Roman"/>
-          <w:sz w:val="24"/>
-          <w:szCs w:val="24"/>
-        </w:rPr>
-        <w:t>`http://localhost:8501`.</w:t>
+        <w:t>Aplikacja otworzy się w przeglądarce pod adresem `http://localhost:8501`.</w:t>
       </w:r>
     </w:p>
     <w:p>
@@ -492,24 +545,60 @@
           <w:sz w:val="24"/>
           <w:szCs w:val="24"/>
         </w:rPr>
-        <w:t>Aplikacja została przygotowana jako lokalna aplikacja internetowa z wykorzystaniem biblioteki Streamlit. Interfejs składa się z formularza podzielonego na sekcję danych wnioskodawcy oraz sekcję danych kredytu.</w:t>
-      </w:r>
-    </w:p>
-    <w:p>
-      <w:pPr>
-        <w:rPr>
-          <w:rFonts w:ascii="Times New Roman" w:hAnsi="Times New Roman" w:cs="Times New Roman"/>
-          <w:sz w:val="24"/>
-          <w:szCs w:val="24"/>
-        </w:rPr>
-      </w:pPr>
-      <w:r>
-        <w:rPr>
-          <w:rFonts w:ascii="Times New Roman" w:hAnsi="Times New Roman" w:cs="Times New Roman"/>
-          <w:sz w:val="24"/>
-          <w:szCs w:val="24"/>
-        </w:rPr>
-        <w:t>Użytkownik podaje między innymi płeć, stan cywilny, dochód, liczbę osób na utrzymaniu, formę zatrudnienia, obecność i dochód współwnioskodawcy, kwotę kredytu, okres kredytowania, historię spłaty zobowiązań oraz lokalizację nieruchomości.</w:t>
+        <w:t xml:space="preserve">Aplikacja została przygotowana jako lokalna aplikacja internetowa z wykorzystaniem biblioteki </w:t>
+      </w:r>
+      <w:proofErr w:type="spellStart"/>
+      <w:r>
+        <w:rPr>
+          <w:rFonts w:ascii="Times New Roman" w:hAnsi="Times New Roman" w:cs="Times New Roman"/>
+          <w:sz w:val="24"/>
+          <w:szCs w:val="24"/>
+        </w:rPr>
+        <w:t>Streamlit</w:t>
+      </w:r>
+      <w:proofErr w:type="spellEnd"/>
+      <w:r>
+        <w:rPr>
+          <w:rFonts w:ascii="Times New Roman" w:hAnsi="Times New Roman" w:cs="Times New Roman"/>
+          <w:sz w:val="24"/>
+          <w:szCs w:val="24"/>
+        </w:rPr>
+        <w:t>. Interfejs składa się z formularza podzielonego na sekcję danych wnioskodawcy oraz sekcję danych kredytu.</w:t>
+      </w:r>
+    </w:p>
+    <w:p>
+      <w:pPr>
+        <w:rPr>
+          <w:rFonts w:ascii="Times New Roman" w:hAnsi="Times New Roman" w:cs="Times New Roman"/>
+          <w:sz w:val="24"/>
+          <w:szCs w:val="24"/>
+        </w:rPr>
+      </w:pPr>
+      <w:r>
+        <w:rPr>
+          <w:rFonts w:ascii="Times New Roman" w:hAnsi="Times New Roman" w:cs="Times New Roman"/>
+          <w:sz w:val="24"/>
+          <w:szCs w:val="24"/>
+        </w:rPr>
+        <w:t xml:space="preserve">Użytkownik podaje między innymi płeć, stan cywilny, dochód, liczbę osób na utrzymaniu, formę zatrudnienia, obecność i dochód </w:t>
+      </w:r>
+      <w:proofErr w:type="spellStart"/>
+      <w:r>
+        <w:rPr>
+          <w:rFonts w:ascii="Times New Roman" w:hAnsi="Times New Roman" w:cs="Times New Roman"/>
+          <w:sz w:val="24"/>
+          <w:szCs w:val="24"/>
+        </w:rPr>
+        <w:t>współwnioskodawcy</w:t>
+      </w:r>
+      <w:proofErr w:type="spellEnd"/>
+      <w:r>
+        <w:rPr>
+          <w:rFonts w:ascii="Times New Roman" w:hAnsi="Times New Roman" w:cs="Times New Roman"/>
+          <w:sz w:val="24"/>
+          <w:szCs w:val="24"/>
+        </w:rPr>
+        <w:t>, kwotę kredytu, okres kredytowania, historię spłaty zobowiązań oraz lokalizację nieruchomości.</w:t>
       </w:r>
     </w:p>
     <w:p>
@@ -628,6 +717,7 @@
           <w:lang w:val="en-US"/>
         </w:rPr>
       </w:pPr>
+      <w:proofErr w:type="spellStart"/>
       <w:r>
         <w:rPr>
           <w:rFonts w:ascii="Times New Roman" w:hAnsi="Times New Roman" w:cs="Times New Roman"/>
@@ -635,7 +725,17 @@
           <w:szCs w:val="24"/>
           <w:lang w:val="en-US"/>
         </w:rPr>
-        <w:t>Streamlit 1.41.1,</w:t>
+        <w:t>Streamlit</w:t>
+      </w:r>
+      <w:proofErr w:type="spellEnd"/>
+      <w:r>
+        <w:rPr>
+          <w:rFonts w:ascii="Times New Roman" w:hAnsi="Times New Roman" w:cs="Times New Roman"/>
+          <w:sz w:val="24"/>
+          <w:szCs w:val="24"/>
+          <w:lang w:val="en-US"/>
+        </w:rPr>
+        <w:t xml:space="preserve"> 1.41.1,</w:t>
       </w:r>
     </w:p>
     <w:p>
@@ -676,7 +776,25 @@
           <w:sz w:val="24"/>
           <w:szCs w:val="24"/>
         </w:rPr>
-        <w:t>Aplikacja była testowana na przeglądarkach Chrome/OperaGX.</w:t>
+        <w:t>Aplikacja była testowana na przeglądarkach Chrome/</w:t>
+      </w:r>
+      <w:proofErr w:type="spellStart"/>
+      <w:r>
+        <w:rPr>
+          <w:rFonts w:ascii="Times New Roman" w:hAnsi="Times New Roman" w:cs="Times New Roman"/>
+          <w:sz w:val="24"/>
+          <w:szCs w:val="24"/>
+        </w:rPr>
+        <w:t>OperaGX</w:t>
+      </w:r>
+      <w:proofErr w:type="spellEnd"/>
+      <w:r>
+        <w:rPr>
+          <w:rFonts w:ascii="Times New Roman" w:hAnsi="Times New Roman" w:cs="Times New Roman"/>
+          <w:sz w:val="24"/>
+          <w:szCs w:val="24"/>
+        </w:rPr>
+        <w:t>.</w:t>
       </w:r>
     </w:p>
     <w:p>
@@ -713,7 +831,25 @@
           <w:sz w:val="24"/>
           <w:szCs w:val="24"/>
         </w:rPr>
-        <w:t>Przed wykonaniem predykcji aplikacja sprawdza poprawność podstawowych danych formularza. Dochód wnioskodawcy oraz wnioskowana kwota kredytu muszą być większe od zera. Jeżeli użytkownik zadeklaruje współwnioskodawcę, wymagane jest podanie jego dochodu.</w:t>
+        <w:t xml:space="preserve">Przed wykonaniem predykcji aplikacja sprawdza poprawność podstawowych danych formularza. Dochód wnioskodawcy oraz wnioskowana kwota kredytu muszą być większe od zera. Jeżeli użytkownik zadeklaruje </w:t>
+      </w:r>
+      <w:proofErr w:type="spellStart"/>
+      <w:r>
+        <w:rPr>
+          <w:rFonts w:ascii="Times New Roman" w:hAnsi="Times New Roman" w:cs="Times New Roman"/>
+          <w:sz w:val="24"/>
+          <w:szCs w:val="24"/>
+        </w:rPr>
+        <w:t>współwnioskodawcę</w:t>
+      </w:r>
+      <w:proofErr w:type="spellEnd"/>
+      <w:r>
+        <w:rPr>
+          <w:rFonts w:ascii="Times New Roman" w:hAnsi="Times New Roman" w:cs="Times New Roman"/>
+          <w:sz w:val="24"/>
+          <w:szCs w:val="24"/>
+        </w:rPr>
+        <w:t>, wymagane jest podanie jego dochodu.</w:t>
       </w:r>
     </w:p>
     <w:p>
@@ -861,6 +997,789 @@
           <w:sz w:val="24"/>
           <w:szCs w:val="24"/>
         </w:rPr>
+        <w:t>Architektura projektu</w:t>
+      </w:r>
+    </w:p>
+    <w:p>
+      <w:pPr>
+        <w:rPr>
+          <w:rFonts w:ascii="Times New Roman" w:hAnsi="Times New Roman" w:cs="Times New Roman"/>
+          <w:sz w:val="24"/>
+          <w:szCs w:val="24"/>
+        </w:rPr>
+      </w:pPr>
+      <w:r>
+        <w:rPr>
+          <w:rFonts w:ascii="Times New Roman" w:hAnsi="Times New Roman" w:cs="Times New Roman"/>
+          <w:sz w:val="24"/>
+          <w:szCs w:val="24"/>
+        </w:rPr>
+        <w:t>Projekt został podzielony na osobne moduły zgodnie z ich odpowiedzialnością:</w:t>
+      </w:r>
+    </w:p>
+    <w:p>
+      <w:pPr>
+        <w:pStyle w:val="ListParagraph"/>
+        <w:numPr>
+          <w:ilvl w:val="0"/>
+          <w:numId w:val="10"/>
+        </w:numPr>
+        <w:rPr>
+          <w:rFonts w:ascii="Times New Roman" w:hAnsi="Times New Roman" w:cs="Times New Roman"/>
+          <w:sz w:val="24"/>
+          <w:szCs w:val="24"/>
+        </w:rPr>
+      </w:pPr>
+      <w:r>
+        <w:rPr>
+          <w:rFonts w:ascii="Times New Roman" w:hAnsi="Times New Roman" w:cs="Times New Roman"/>
+          <w:sz w:val="24"/>
+          <w:szCs w:val="24"/>
+        </w:rPr>
+        <w:t>data – dane surowe i dane przygotowane do treningu,</w:t>
+      </w:r>
+    </w:p>
+    <w:p>
+      <w:pPr>
+        <w:pStyle w:val="ListParagraph"/>
+        <w:numPr>
+          <w:ilvl w:val="0"/>
+          <w:numId w:val="10"/>
+        </w:numPr>
+        <w:rPr>
+          <w:rFonts w:ascii="Times New Roman" w:hAnsi="Times New Roman" w:cs="Times New Roman"/>
+          <w:sz w:val="24"/>
+          <w:szCs w:val="24"/>
+        </w:rPr>
+      </w:pPr>
+      <w:r>
+        <w:rPr>
+          <w:rFonts w:ascii="Times New Roman" w:hAnsi="Times New Roman" w:cs="Times New Roman"/>
+          <w:sz w:val="24"/>
+          <w:szCs w:val="24"/>
+        </w:rPr>
+        <w:t xml:space="preserve">model – </w:t>
+      </w:r>
+      <w:proofErr w:type="spellStart"/>
+      <w:r>
+        <w:rPr>
+          <w:rFonts w:ascii="Times New Roman" w:hAnsi="Times New Roman" w:cs="Times New Roman"/>
+          <w:sz w:val="24"/>
+          <w:szCs w:val="24"/>
+        </w:rPr>
+        <w:t>preprocessing</w:t>
+      </w:r>
+      <w:proofErr w:type="spellEnd"/>
+      <w:r>
+        <w:rPr>
+          <w:rFonts w:ascii="Times New Roman" w:hAnsi="Times New Roman" w:cs="Times New Roman"/>
+          <w:sz w:val="24"/>
+          <w:szCs w:val="24"/>
+        </w:rPr>
+        <w:t>, trening, porównanie modeli oraz zapis modelu do pliku .</w:t>
+      </w:r>
+      <w:proofErr w:type="spellStart"/>
+      <w:r>
+        <w:rPr>
+          <w:rFonts w:ascii="Times New Roman" w:hAnsi="Times New Roman" w:cs="Times New Roman"/>
+          <w:sz w:val="24"/>
+          <w:szCs w:val="24"/>
+        </w:rPr>
+        <w:t>pkl</w:t>
+      </w:r>
+      <w:proofErr w:type="spellEnd"/>
+      <w:r>
+        <w:rPr>
+          <w:rFonts w:ascii="Times New Roman" w:hAnsi="Times New Roman" w:cs="Times New Roman"/>
+          <w:sz w:val="24"/>
+          <w:szCs w:val="24"/>
+        </w:rPr>
+        <w:t>,</w:t>
+      </w:r>
+    </w:p>
+    <w:p>
+      <w:pPr>
+        <w:pStyle w:val="ListParagraph"/>
+        <w:numPr>
+          <w:ilvl w:val="0"/>
+          <w:numId w:val="10"/>
+        </w:numPr>
+        <w:rPr>
+          <w:rFonts w:ascii="Times New Roman" w:hAnsi="Times New Roman" w:cs="Times New Roman"/>
+          <w:sz w:val="24"/>
+          <w:szCs w:val="24"/>
+        </w:rPr>
+      </w:pPr>
+      <w:proofErr w:type="spellStart"/>
+      <w:r>
+        <w:rPr>
+          <w:rFonts w:ascii="Times New Roman" w:hAnsi="Times New Roman" w:cs="Times New Roman"/>
+          <w:sz w:val="24"/>
+          <w:szCs w:val="24"/>
+        </w:rPr>
+        <w:t>app</w:t>
+      </w:r>
+      <w:proofErr w:type="spellEnd"/>
+      <w:r>
+        <w:rPr>
+          <w:rFonts w:ascii="Times New Roman" w:hAnsi="Times New Roman" w:cs="Times New Roman"/>
+          <w:sz w:val="24"/>
+          <w:szCs w:val="24"/>
+        </w:rPr>
+        <w:t xml:space="preserve"> – aplikacja </w:t>
+      </w:r>
+      <w:proofErr w:type="spellStart"/>
+      <w:r>
+        <w:rPr>
+          <w:rFonts w:ascii="Times New Roman" w:hAnsi="Times New Roman" w:cs="Times New Roman"/>
+          <w:sz w:val="24"/>
+          <w:szCs w:val="24"/>
+        </w:rPr>
+        <w:t>Streamlit</w:t>
+      </w:r>
+      <w:proofErr w:type="spellEnd"/>
+      <w:r>
+        <w:rPr>
+          <w:rFonts w:ascii="Times New Roman" w:hAnsi="Times New Roman" w:cs="Times New Roman"/>
+          <w:sz w:val="24"/>
+          <w:szCs w:val="24"/>
+        </w:rPr>
+        <w:t>, formularz, walidacja danych i prezentacja wyniku,</w:t>
+      </w:r>
+    </w:p>
+    <w:p>
+      <w:pPr>
+        <w:pStyle w:val="ListParagraph"/>
+        <w:numPr>
+          <w:ilvl w:val="0"/>
+          <w:numId w:val="10"/>
+        </w:numPr>
+        <w:rPr>
+          <w:rFonts w:ascii="Times New Roman" w:hAnsi="Times New Roman" w:cs="Times New Roman"/>
+          <w:sz w:val="24"/>
+          <w:szCs w:val="24"/>
+        </w:rPr>
+      </w:pPr>
+      <w:proofErr w:type="spellStart"/>
+      <w:r>
+        <w:rPr>
+          <w:rFonts w:ascii="Times New Roman" w:hAnsi="Times New Roman" w:cs="Times New Roman"/>
+          <w:sz w:val="24"/>
+          <w:szCs w:val="24"/>
+        </w:rPr>
+        <w:t>tests</w:t>
+      </w:r>
+      <w:proofErr w:type="spellEnd"/>
+      <w:r>
+        <w:rPr>
+          <w:rFonts w:ascii="Times New Roman" w:hAnsi="Times New Roman" w:cs="Times New Roman"/>
+          <w:sz w:val="24"/>
+          <w:szCs w:val="24"/>
+        </w:rPr>
+        <w:t xml:space="preserve"> – testy integracji aplikacji z zapisanym modelem.</w:t>
+      </w:r>
+    </w:p>
+    <w:p>
+      <w:pPr>
+        <w:rPr>
+          <w:rFonts w:ascii="Times New Roman" w:hAnsi="Times New Roman" w:cs="Times New Roman"/>
+          <w:sz w:val="24"/>
+          <w:szCs w:val="24"/>
+        </w:rPr>
+      </w:pPr>
+      <w:r>
+        <w:rPr>
+          <w:rFonts w:ascii="Times New Roman" w:hAnsi="Times New Roman" w:cs="Times New Roman"/>
+          <w:sz w:val="24"/>
+          <w:szCs w:val="24"/>
+        </w:rPr>
+        <w:t>Taki podział oddziela przygotowanie danych, trenowanie modelu i działanie aplikacji webowej.</w:t>
+      </w:r>
+    </w:p>
+    <w:p>
+      <w:pPr>
+        <w:rPr>
+          <w:rFonts w:ascii="Times New Roman" w:hAnsi="Times New Roman" w:cs="Times New Roman"/>
+          <w:b/>
+          <w:bCs/>
+          <w:sz w:val="24"/>
+          <w:szCs w:val="24"/>
+        </w:rPr>
+      </w:pPr>
+      <w:r>
+        <w:rPr>
+          <w:rFonts w:ascii="Times New Roman" w:hAnsi="Times New Roman" w:cs="Times New Roman"/>
+          <w:b/>
+          <w:bCs/>
+          <w:sz w:val="24"/>
+          <w:szCs w:val="24"/>
+        </w:rPr>
+        <w:t>Testowanie aplikacji</w:t>
+      </w:r>
+    </w:p>
+    <w:p>
+      <w:pPr>
+        <w:rPr>
+          <w:rFonts w:ascii="Times New Roman" w:hAnsi="Times New Roman" w:cs="Times New Roman"/>
+          <w:sz w:val="24"/>
+          <w:szCs w:val="24"/>
+        </w:rPr>
+      </w:pPr>
+      <w:r>
+        <w:rPr>
+          <w:rFonts w:ascii="Times New Roman" w:hAnsi="Times New Roman" w:cs="Times New Roman"/>
+          <w:sz w:val="24"/>
+          <w:szCs w:val="24"/>
+        </w:rPr>
+        <w:t>W projekcie przygotowano 11 testów integracyjnych. Sprawdzają one:</w:t>
+      </w:r>
+    </w:p>
+    <w:p>
+      <w:pPr>
+        <w:pStyle w:val="ListParagraph"/>
+        <w:numPr>
+          <w:ilvl w:val="0"/>
+          <w:numId w:val="11"/>
+        </w:numPr>
+        <w:rPr>
+          <w:rFonts w:ascii="Times New Roman" w:hAnsi="Times New Roman" w:cs="Times New Roman"/>
+          <w:sz w:val="24"/>
+          <w:szCs w:val="24"/>
+        </w:rPr>
+      </w:pPr>
+      <w:r>
+        <w:rPr>
+          <w:rFonts w:ascii="Times New Roman" w:hAnsi="Times New Roman" w:cs="Times New Roman"/>
+          <w:sz w:val="24"/>
+          <w:szCs w:val="24"/>
+        </w:rPr>
+        <w:t>zgodność danych formularza z wektorem wejściowym modelu,</w:t>
+      </w:r>
+    </w:p>
+    <w:p>
+      <w:pPr>
+        <w:pStyle w:val="ListParagraph"/>
+        <w:numPr>
+          <w:ilvl w:val="0"/>
+          <w:numId w:val="11"/>
+        </w:numPr>
+        <w:rPr>
+          <w:rFonts w:ascii="Times New Roman" w:hAnsi="Times New Roman" w:cs="Times New Roman"/>
+          <w:sz w:val="24"/>
+          <w:szCs w:val="24"/>
+        </w:rPr>
+      </w:pPr>
+      <w:r>
+        <w:rPr>
+          <w:rFonts w:ascii="Times New Roman" w:hAnsi="Times New Roman" w:cs="Times New Roman"/>
+          <w:sz w:val="24"/>
+          <w:szCs w:val="24"/>
+        </w:rPr>
+        <w:t>kodowanie danych tekstowych,</w:t>
+      </w:r>
+    </w:p>
+    <w:p>
+      <w:pPr>
+        <w:pStyle w:val="ListParagraph"/>
+        <w:numPr>
+          <w:ilvl w:val="0"/>
+          <w:numId w:val="11"/>
+        </w:numPr>
+        <w:rPr>
+          <w:rFonts w:ascii="Times New Roman" w:hAnsi="Times New Roman" w:cs="Times New Roman"/>
+          <w:sz w:val="24"/>
+          <w:szCs w:val="24"/>
+        </w:rPr>
+      </w:pPr>
+      <w:r>
+        <w:rPr>
+          <w:rFonts w:ascii="Times New Roman" w:hAnsi="Times New Roman" w:cs="Times New Roman"/>
+          <w:sz w:val="24"/>
+          <w:szCs w:val="24"/>
+        </w:rPr>
+        <w:t>przekazywanie płci wybranej przez użytkownika,</w:t>
+      </w:r>
+    </w:p>
+    <w:p>
+      <w:pPr>
+        <w:pStyle w:val="ListParagraph"/>
+        <w:numPr>
+          <w:ilvl w:val="0"/>
+          <w:numId w:val="11"/>
+        </w:numPr>
+        <w:rPr>
+          <w:rFonts w:ascii="Times New Roman" w:hAnsi="Times New Roman" w:cs="Times New Roman"/>
+          <w:sz w:val="24"/>
+          <w:szCs w:val="24"/>
+        </w:rPr>
+      </w:pPr>
+      <w:r>
+        <w:rPr>
+          <w:rFonts w:ascii="Times New Roman" w:hAnsi="Times New Roman" w:cs="Times New Roman"/>
+          <w:sz w:val="24"/>
+          <w:szCs w:val="24"/>
+        </w:rPr>
+        <w:t>walidację dochodu i kwoty kredytu,</w:t>
+      </w:r>
+    </w:p>
+    <w:p>
+      <w:pPr>
+        <w:pStyle w:val="ListParagraph"/>
+        <w:numPr>
+          <w:ilvl w:val="0"/>
+          <w:numId w:val="11"/>
+        </w:numPr>
+        <w:rPr>
+          <w:rFonts w:ascii="Times New Roman" w:hAnsi="Times New Roman" w:cs="Times New Roman"/>
+          <w:sz w:val="24"/>
+          <w:szCs w:val="24"/>
+        </w:rPr>
+      </w:pPr>
+      <w:r>
+        <w:rPr>
+          <w:rFonts w:ascii="Times New Roman" w:hAnsi="Times New Roman" w:cs="Times New Roman"/>
+          <w:sz w:val="24"/>
+          <w:szCs w:val="24"/>
+        </w:rPr>
+        <w:t xml:space="preserve">obsługę dochodu </w:t>
+      </w:r>
+      <w:proofErr w:type="spellStart"/>
+      <w:r>
+        <w:rPr>
+          <w:rFonts w:ascii="Times New Roman" w:hAnsi="Times New Roman" w:cs="Times New Roman"/>
+          <w:sz w:val="24"/>
+          <w:szCs w:val="24"/>
+        </w:rPr>
+        <w:t>współwnioskodawcy</w:t>
+      </w:r>
+      <w:proofErr w:type="spellEnd"/>
+      <w:r>
+        <w:rPr>
+          <w:rFonts w:ascii="Times New Roman" w:hAnsi="Times New Roman" w:cs="Times New Roman"/>
+          <w:sz w:val="24"/>
+          <w:szCs w:val="24"/>
+        </w:rPr>
+        <w:t>,</w:t>
+      </w:r>
+    </w:p>
+    <w:p>
+      <w:pPr>
+        <w:pStyle w:val="ListParagraph"/>
+        <w:numPr>
+          <w:ilvl w:val="0"/>
+          <w:numId w:val="11"/>
+        </w:numPr>
+        <w:rPr>
+          <w:rFonts w:ascii="Times New Roman" w:hAnsi="Times New Roman" w:cs="Times New Roman"/>
+          <w:sz w:val="24"/>
+          <w:szCs w:val="24"/>
+        </w:rPr>
+      </w:pPr>
+      <w:r>
+        <w:rPr>
+          <w:rFonts w:ascii="Times New Roman" w:hAnsi="Times New Roman" w:cs="Times New Roman"/>
+          <w:sz w:val="24"/>
+          <w:szCs w:val="24"/>
+        </w:rPr>
+        <w:t>działanie predykcji z rzeczywistym modelem .</w:t>
+      </w:r>
+      <w:proofErr w:type="spellStart"/>
+      <w:r>
+        <w:rPr>
+          <w:rFonts w:ascii="Times New Roman" w:hAnsi="Times New Roman" w:cs="Times New Roman"/>
+          <w:sz w:val="24"/>
+          <w:szCs w:val="24"/>
+        </w:rPr>
+        <w:t>pkl</w:t>
+      </w:r>
+      <w:proofErr w:type="spellEnd"/>
+      <w:r>
+        <w:rPr>
+          <w:rFonts w:ascii="Times New Roman" w:hAnsi="Times New Roman" w:cs="Times New Roman"/>
+          <w:sz w:val="24"/>
+          <w:szCs w:val="24"/>
+        </w:rPr>
+        <w:t>,</w:t>
+      </w:r>
+    </w:p>
+    <w:p>
+      <w:pPr>
+        <w:pStyle w:val="ListParagraph"/>
+        <w:numPr>
+          <w:ilvl w:val="0"/>
+          <w:numId w:val="11"/>
+        </w:numPr>
+        <w:rPr>
+          <w:rFonts w:ascii="Times New Roman" w:hAnsi="Times New Roman" w:cs="Times New Roman"/>
+          <w:sz w:val="24"/>
+          <w:szCs w:val="24"/>
+        </w:rPr>
+      </w:pPr>
+      <w:r>
+        <w:rPr>
+          <w:rFonts w:ascii="Times New Roman" w:hAnsi="Times New Roman" w:cs="Times New Roman"/>
+          <w:sz w:val="24"/>
+          <w:szCs w:val="24"/>
+        </w:rPr>
+        <w:t>obsługę braku i uszkodzenia modelu,</w:t>
+      </w:r>
+    </w:p>
+    <w:p>
+      <w:pPr>
+        <w:pStyle w:val="ListParagraph"/>
+        <w:numPr>
+          <w:ilvl w:val="0"/>
+          <w:numId w:val="11"/>
+        </w:numPr>
+        <w:rPr>
+          <w:rFonts w:ascii="Times New Roman" w:hAnsi="Times New Roman" w:cs="Times New Roman"/>
+          <w:sz w:val="24"/>
+          <w:szCs w:val="24"/>
+        </w:rPr>
+      </w:pPr>
+      <w:r>
+        <w:rPr>
+          <w:rFonts w:ascii="Times New Roman" w:hAnsi="Times New Roman" w:cs="Times New Roman"/>
+          <w:sz w:val="24"/>
+          <w:szCs w:val="24"/>
+        </w:rPr>
+        <w:t>wykrywanie niezgodnego zestawu cech,</w:t>
+      </w:r>
+    </w:p>
+    <w:p>
+      <w:pPr>
+        <w:pStyle w:val="ListParagraph"/>
+        <w:numPr>
+          <w:ilvl w:val="0"/>
+          <w:numId w:val="11"/>
+        </w:numPr>
+        <w:rPr>
+          <w:rFonts w:ascii="Times New Roman" w:hAnsi="Times New Roman" w:cs="Times New Roman"/>
+          <w:sz w:val="24"/>
+          <w:szCs w:val="24"/>
+        </w:rPr>
+      </w:pPr>
+      <w:r>
+        <w:rPr>
+          <w:rFonts w:ascii="Times New Roman" w:hAnsi="Times New Roman" w:cs="Times New Roman"/>
+          <w:sz w:val="24"/>
+          <w:szCs w:val="24"/>
+        </w:rPr>
+        <w:t>obsługę błędu predykcji,</w:t>
+      </w:r>
+    </w:p>
+    <w:p>
+      <w:pPr>
+        <w:pStyle w:val="ListParagraph"/>
+        <w:numPr>
+          <w:ilvl w:val="0"/>
+          <w:numId w:val="11"/>
+        </w:numPr>
+        <w:rPr>
+          <w:rFonts w:ascii="Times New Roman" w:hAnsi="Times New Roman" w:cs="Times New Roman"/>
+          <w:sz w:val="24"/>
+          <w:szCs w:val="24"/>
+        </w:rPr>
+      </w:pPr>
+      <w:r>
+        <w:rPr>
+          <w:rFonts w:ascii="Times New Roman" w:hAnsi="Times New Roman" w:cs="Times New Roman"/>
+          <w:sz w:val="24"/>
+          <w:szCs w:val="24"/>
+        </w:rPr>
+        <w:t>brak fikcyjnego wyniku w przypadku błędu.</w:t>
+      </w:r>
+    </w:p>
+    <w:p>
+      <w:pPr>
+        <w:rPr>
+          <w:rFonts w:ascii="Times New Roman" w:hAnsi="Times New Roman" w:cs="Times New Roman"/>
+          <w:sz w:val="24"/>
+          <w:szCs w:val="24"/>
+        </w:rPr>
+      </w:pPr>
+      <w:r>
+        <w:rPr>
+          <w:rFonts w:ascii="Times New Roman" w:hAnsi="Times New Roman" w:cs="Times New Roman"/>
+          <w:sz w:val="24"/>
+          <w:szCs w:val="24"/>
+        </w:rPr>
+        <w:t>Testy można uruchomić poleceniem:</w:t>
+      </w:r>
+    </w:p>
+    <w:p>
+      <w:pPr>
+        <w:rPr>
+          <w:rFonts w:ascii="Times New Roman" w:hAnsi="Times New Roman" w:cs="Times New Roman"/>
+          <w:sz w:val="24"/>
+          <w:szCs w:val="24"/>
+          <w:lang w:val="en-US"/>
+        </w:rPr>
+      </w:pPr>
+      <w:r>
+        <w:rPr>
+          <w:rFonts w:ascii="Times New Roman" w:hAnsi="Times New Roman" w:cs="Times New Roman"/>
+          <w:sz w:val="24"/>
+          <w:szCs w:val="24"/>
+          <w:lang w:val="en-US"/>
+        </w:rPr>
+        <w:t>.\.</w:t>
+      </w:r>
+      <w:proofErr w:type="spellStart"/>
+      <w:r>
+        <w:rPr>
+          <w:rFonts w:ascii="Times New Roman" w:hAnsi="Times New Roman" w:cs="Times New Roman"/>
+          <w:sz w:val="24"/>
+          <w:szCs w:val="24"/>
+          <w:lang w:val="en-US"/>
+        </w:rPr>
+        <w:t>venv</w:t>
+      </w:r>
+      <w:proofErr w:type="spellEnd"/>
+      <w:r>
+        <w:rPr>
+          <w:rFonts w:ascii="Times New Roman" w:hAnsi="Times New Roman" w:cs="Times New Roman"/>
+          <w:sz w:val="24"/>
+          <w:szCs w:val="24"/>
+          <w:lang w:val="en-US"/>
+        </w:rPr>
+        <w:t xml:space="preserve">\Scripts\python.exe -m </w:t>
+      </w:r>
+      <w:proofErr w:type="spellStart"/>
+      <w:r>
+        <w:rPr>
+          <w:rFonts w:ascii="Times New Roman" w:hAnsi="Times New Roman" w:cs="Times New Roman"/>
+          <w:sz w:val="24"/>
+          <w:szCs w:val="24"/>
+          <w:lang w:val="en-US"/>
+        </w:rPr>
+        <w:t>unittest</w:t>
+      </w:r>
+      <w:proofErr w:type="spellEnd"/>
+      <w:r>
+        <w:rPr>
+          <w:rFonts w:ascii="Times New Roman" w:hAnsi="Times New Roman" w:cs="Times New Roman"/>
+          <w:sz w:val="24"/>
+          <w:szCs w:val="24"/>
+          <w:lang w:val="en-US"/>
+        </w:rPr>
+        <w:t xml:space="preserve"> discover -s tests -v</w:t>
+      </w:r>
+    </w:p>
+    <w:p>
+      <w:pPr>
+        <w:rPr>
+          <w:rFonts w:ascii="Times New Roman" w:hAnsi="Times New Roman" w:cs="Times New Roman"/>
+          <w:sz w:val="24"/>
+          <w:szCs w:val="24"/>
+        </w:rPr>
+      </w:pPr>
+      <w:r>
+        <w:rPr>
+          <w:rFonts w:ascii="Times New Roman" w:hAnsi="Times New Roman" w:cs="Times New Roman"/>
+          <w:sz w:val="24"/>
+          <w:szCs w:val="24"/>
+        </w:rPr>
+        <w:t>Podczas ostatniej weryfikacji wszystkie 11 testów zakończyło się powodzeniem.</w:t>
+      </w:r>
+    </w:p>
+    <w:p>
+      <w:pPr>
+        <w:rPr>
+          <w:rFonts w:ascii="Times New Roman" w:hAnsi="Times New Roman" w:cs="Times New Roman"/>
+          <w:b/>
+          <w:bCs/>
+          <w:sz w:val="24"/>
+          <w:szCs w:val="24"/>
+        </w:rPr>
+      </w:pPr>
+    </w:p>
+    <w:p>
+      <w:pPr>
+        <w:rPr>
+          <w:rFonts w:ascii="Times New Roman" w:hAnsi="Times New Roman" w:cs="Times New Roman"/>
+          <w:b/>
+          <w:bCs/>
+          <w:sz w:val="24"/>
+          <w:szCs w:val="24"/>
+        </w:rPr>
+      </w:pPr>
+    </w:p>
+    <w:p>
+      <w:pPr>
+        <w:rPr>
+          <w:rFonts w:ascii="Times New Roman" w:hAnsi="Times New Roman" w:cs="Times New Roman"/>
+          <w:b/>
+          <w:bCs/>
+          <w:sz w:val="24"/>
+          <w:szCs w:val="24"/>
+        </w:rPr>
+      </w:pPr>
+      <w:r>
+        <w:rPr>
+          <w:rFonts w:ascii="Times New Roman" w:hAnsi="Times New Roman" w:cs="Times New Roman"/>
+          <w:b/>
+          <w:bCs/>
+          <w:sz w:val="24"/>
+          <w:szCs w:val="24"/>
+        </w:rPr>
+        <w:lastRenderedPageBreak/>
+        <w:t>Jakość kodu</w:t>
+      </w:r>
+    </w:p>
+    <w:p>
+      <w:pPr>
+        <w:rPr>
+          <w:rFonts w:ascii="Times New Roman" w:hAnsi="Times New Roman" w:cs="Times New Roman"/>
+          <w:sz w:val="24"/>
+          <w:szCs w:val="24"/>
+        </w:rPr>
+      </w:pPr>
+      <w:r>
+        <w:rPr>
+          <w:rFonts w:ascii="Times New Roman" w:hAnsi="Times New Roman" w:cs="Times New Roman"/>
+          <w:sz w:val="24"/>
+          <w:szCs w:val="24"/>
+        </w:rPr>
+        <w:t xml:space="preserve">Do kontroli jakości kodu wykorzystano narzędzie </w:t>
+      </w:r>
+      <w:proofErr w:type="spellStart"/>
+      <w:r>
+        <w:rPr>
+          <w:rFonts w:ascii="Times New Roman" w:hAnsi="Times New Roman" w:cs="Times New Roman"/>
+          <w:sz w:val="24"/>
+          <w:szCs w:val="24"/>
+        </w:rPr>
+        <w:t>Pylint</w:t>
+      </w:r>
+      <w:proofErr w:type="spellEnd"/>
+      <w:r>
+        <w:rPr>
+          <w:rFonts w:ascii="Times New Roman" w:hAnsi="Times New Roman" w:cs="Times New Roman"/>
+          <w:sz w:val="24"/>
+          <w:szCs w:val="24"/>
+        </w:rPr>
+        <w:t>. Sprawdzenie można uruchomić poleceniem:</w:t>
+      </w:r>
+    </w:p>
+    <w:p>
+      <w:pPr>
+        <w:rPr>
+          <w:rFonts w:ascii="Times New Roman" w:hAnsi="Times New Roman" w:cs="Times New Roman"/>
+          <w:sz w:val="24"/>
+          <w:szCs w:val="24"/>
+          <w:lang w:val="en-US"/>
+        </w:rPr>
+      </w:pPr>
+      <w:r>
+        <w:rPr>
+          <w:rFonts w:ascii="Times New Roman" w:hAnsi="Times New Roman" w:cs="Times New Roman"/>
+          <w:sz w:val="24"/>
+          <w:szCs w:val="24"/>
+          <w:lang w:val="en-US"/>
+        </w:rPr>
+        <w:t>.\.</w:t>
+      </w:r>
+      <w:proofErr w:type="spellStart"/>
+      <w:r>
+        <w:rPr>
+          <w:rFonts w:ascii="Times New Roman" w:hAnsi="Times New Roman" w:cs="Times New Roman"/>
+          <w:sz w:val="24"/>
+          <w:szCs w:val="24"/>
+          <w:lang w:val="en-US"/>
+        </w:rPr>
+        <w:t>venv</w:t>
+      </w:r>
+      <w:proofErr w:type="spellEnd"/>
+      <w:r>
+        <w:rPr>
+          <w:rFonts w:ascii="Times New Roman" w:hAnsi="Times New Roman" w:cs="Times New Roman"/>
+          <w:sz w:val="24"/>
+          <w:szCs w:val="24"/>
+          <w:lang w:val="en-US"/>
+        </w:rPr>
+        <w:t xml:space="preserve">\Scripts\python.exe -m </w:t>
+      </w:r>
+      <w:proofErr w:type="spellStart"/>
+      <w:r>
+        <w:rPr>
+          <w:rFonts w:ascii="Times New Roman" w:hAnsi="Times New Roman" w:cs="Times New Roman"/>
+          <w:sz w:val="24"/>
+          <w:szCs w:val="24"/>
+          <w:lang w:val="en-US"/>
+        </w:rPr>
+        <w:t>pylint</w:t>
+      </w:r>
+      <w:proofErr w:type="spellEnd"/>
+      <w:r>
+        <w:rPr>
+          <w:rFonts w:ascii="Times New Roman" w:hAnsi="Times New Roman" w:cs="Times New Roman"/>
+          <w:sz w:val="24"/>
+          <w:szCs w:val="24"/>
+          <w:lang w:val="en-US"/>
+        </w:rPr>
+        <w:t xml:space="preserve"> app\streamlit_app.py model\train_model.py tests\test_model_integration.py</w:t>
+      </w:r>
+    </w:p>
+    <w:p>
+      <w:pPr>
+        <w:rPr>
+          <w:rFonts w:ascii="Times New Roman" w:hAnsi="Times New Roman" w:cs="Times New Roman"/>
+          <w:sz w:val="24"/>
+          <w:szCs w:val="24"/>
+        </w:rPr>
+      </w:pPr>
+      <w:r>
+        <w:rPr>
+          <w:rFonts w:ascii="Times New Roman" w:hAnsi="Times New Roman" w:cs="Times New Roman"/>
+          <w:sz w:val="24"/>
+          <w:szCs w:val="24"/>
+        </w:rPr>
+        <w:t>Podczas ostatniej weryfikacji projekt uzyskał wynik 9,</w:t>
+      </w:r>
+      <w:r>
+        <w:rPr>
+          <w:rFonts w:ascii="Times New Roman" w:hAnsi="Times New Roman" w:cs="Times New Roman"/>
+          <w:sz w:val="24"/>
+          <w:szCs w:val="24"/>
+        </w:rPr>
+        <w:t>82</w:t>
+      </w:r>
+      <w:r>
+        <w:rPr>
+          <w:rFonts w:ascii="Times New Roman" w:hAnsi="Times New Roman" w:cs="Times New Roman"/>
+          <w:sz w:val="24"/>
+          <w:szCs w:val="24"/>
+        </w:rPr>
+        <w:t>/10</w:t>
+      </w:r>
+      <w:r>
+        <w:rPr>
+          <w:rFonts w:ascii="Times New Roman" w:hAnsi="Times New Roman" w:cs="Times New Roman"/>
+          <w:sz w:val="24"/>
+          <w:szCs w:val="24"/>
+        </w:rPr>
+        <w:t>.</w:t>
+      </w:r>
+    </w:p>
+    <w:p>
+      <w:pPr>
+        <w:rPr>
+          <w:rFonts w:ascii="Times New Roman" w:hAnsi="Times New Roman" w:cs="Times New Roman"/>
+          <w:b/>
+          <w:bCs/>
+          <w:sz w:val="24"/>
+          <w:szCs w:val="24"/>
+        </w:rPr>
+      </w:pPr>
+      <w:r>
+        <w:rPr>
+          <w:rFonts w:ascii="Times New Roman" w:hAnsi="Times New Roman" w:cs="Times New Roman"/>
+          <w:b/>
+          <w:bCs/>
+          <w:sz w:val="24"/>
+          <w:szCs w:val="24"/>
+        </w:rPr>
         <w:t>Podział pracy</w:t>
       </w:r>
     </w:p>
@@ -900,7 +1819,25 @@
           <w:sz w:val="24"/>
           <w:szCs w:val="24"/>
         </w:rPr>
-        <w:t>przygotowanie i analiza datasetu,</w:t>
+        <w:t xml:space="preserve">przygotowanie i analiza </w:t>
+      </w:r>
+      <w:proofErr w:type="spellStart"/>
+      <w:r>
+        <w:rPr>
+          <w:rFonts w:ascii="Times New Roman" w:hAnsi="Times New Roman" w:cs="Times New Roman"/>
+          <w:sz w:val="24"/>
+          <w:szCs w:val="24"/>
+        </w:rPr>
+        <w:t>datasetu</w:t>
+      </w:r>
+      <w:proofErr w:type="spellEnd"/>
+      <w:r>
+        <w:rPr>
+          <w:rFonts w:ascii="Times New Roman" w:hAnsi="Times New Roman" w:cs="Times New Roman"/>
+          <w:sz w:val="24"/>
+          <w:szCs w:val="24"/>
+        </w:rPr>
+        <w:t>,</w:t>
       </w:r>
     </w:p>
     <w:p>
@@ -916,13 +1853,23 @@
           <w:szCs w:val="24"/>
         </w:rPr>
       </w:pPr>
-      <w:r>
-        <w:rPr>
-          <w:rFonts w:ascii="Times New Roman" w:hAnsi="Times New Roman" w:cs="Times New Roman"/>
-          <w:sz w:val="24"/>
-          <w:szCs w:val="24"/>
-        </w:rPr>
-        <w:t>preprocessing danych,</w:t>
+      <w:proofErr w:type="spellStart"/>
+      <w:r>
+        <w:rPr>
+          <w:rFonts w:ascii="Times New Roman" w:hAnsi="Times New Roman" w:cs="Times New Roman"/>
+          <w:sz w:val="24"/>
+          <w:szCs w:val="24"/>
+        </w:rPr>
+        <w:t>preprocessing</w:t>
+      </w:r>
+      <w:proofErr w:type="spellEnd"/>
+      <w:r>
+        <w:rPr>
+          <w:rFonts w:ascii="Times New Roman" w:hAnsi="Times New Roman" w:cs="Times New Roman"/>
+          <w:sz w:val="24"/>
+          <w:szCs w:val="24"/>
+        </w:rPr>
+        <w:t xml:space="preserve"> danych,</w:t>
       </w:r>
     </w:p>
     <w:p>
@@ -1010,7 +1957,25 @@
           <w:sz w:val="24"/>
           <w:szCs w:val="24"/>
         </w:rPr>
-        <w:t>zapis modelu do pliku .pkl.</w:t>
+        <w:t>zapis modelu do pliku .</w:t>
+      </w:r>
+      <w:proofErr w:type="spellStart"/>
+      <w:r>
+        <w:rPr>
+          <w:rFonts w:ascii="Times New Roman" w:hAnsi="Times New Roman" w:cs="Times New Roman"/>
+          <w:sz w:val="24"/>
+          <w:szCs w:val="24"/>
+        </w:rPr>
+        <w:t>pkl</w:t>
+      </w:r>
+      <w:proofErr w:type="spellEnd"/>
+      <w:r>
+        <w:rPr>
+          <w:rFonts w:ascii="Times New Roman" w:hAnsi="Times New Roman" w:cs="Times New Roman"/>
+          <w:sz w:val="24"/>
+          <w:szCs w:val="24"/>
+        </w:rPr>
+        <w:t>.</w:t>
       </w:r>
     </w:p>
     <w:p>
@@ -1093,7 +2058,25 @@
           <w:sz w:val="24"/>
           <w:szCs w:val="24"/>
         </w:rPr>
-        <w:t>implementacja aplikacji webowej w Streamlit,</w:t>
+        <w:t xml:space="preserve">implementacja aplikacji webowej w </w:t>
+      </w:r>
+      <w:proofErr w:type="spellStart"/>
+      <w:r>
+        <w:rPr>
+          <w:rFonts w:ascii="Times New Roman" w:hAnsi="Times New Roman" w:cs="Times New Roman"/>
+          <w:sz w:val="24"/>
+          <w:szCs w:val="24"/>
+        </w:rPr>
+        <w:t>Streamlit</w:t>
+      </w:r>
+      <w:proofErr w:type="spellEnd"/>
+      <w:r>
+        <w:rPr>
+          <w:rFonts w:ascii="Times New Roman" w:hAnsi="Times New Roman" w:cs="Times New Roman"/>
+          <w:sz w:val="24"/>
+          <w:szCs w:val="24"/>
+        </w:rPr>
+        <w:t>,</w:t>
       </w:r>
     </w:p>
     <w:p>
@@ -1700,6 +2683,119 @@
     </w:lvl>
   </w:abstractNum>
   <w:abstractNum w:abstractNumId="4" w15:restartNumberingAfterBreak="0">
+    <w:nsid w:val="33E751D0"/>
+    <w:multiLevelType w:val="hybridMultilevel"/>
+    <w:tmpl w:val="10AABD12"/>
+    <w:lvl w:ilvl="0" w:tplc="04150001">
+      <w:start w:val="1"/>
+      <w:numFmt w:val="bullet"/>
+      <w:lvlText w:val=""/>
+      <w:lvlJc w:val="left"/>
+      <w:pPr>
+        <w:ind w:left="720" w:hanging="360"/>
+      </w:pPr>
+      <w:rPr>
+        <w:rFonts w:ascii="Symbol" w:hAnsi="Symbol" w:hint="default"/>
+      </w:rPr>
+    </w:lvl>
+    <w:lvl w:ilvl="1" w:tplc="04150003" w:tentative="1">
+      <w:start w:val="1"/>
+      <w:numFmt w:val="bullet"/>
+      <w:lvlText w:val="o"/>
+      <w:lvlJc w:val="left"/>
+      <w:pPr>
+        <w:ind w:left="1440" w:hanging="360"/>
+      </w:pPr>
+      <w:rPr>
+        <w:rFonts w:ascii="Courier New" w:hAnsi="Courier New" w:cs="Courier New" w:hint="default"/>
+      </w:rPr>
+    </w:lvl>
+    <w:lvl w:ilvl="2" w:tplc="04150005" w:tentative="1">
+      <w:start w:val="1"/>
+      <w:numFmt w:val="bullet"/>
+      <w:lvlText w:val=""/>
+      <w:lvlJc w:val="left"/>
+      <w:pPr>
+        <w:ind w:left="2160" w:hanging="360"/>
+      </w:pPr>
+      <w:rPr>
+        <w:rFonts w:ascii="Wingdings" w:hAnsi="Wingdings" w:hint="default"/>
+      </w:rPr>
+    </w:lvl>
+    <w:lvl w:ilvl="3" w:tplc="04150001" w:tentative="1">
+      <w:start w:val="1"/>
+      <w:numFmt w:val="bullet"/>
+      <w:lvlText w:val=""/>
+      <w:lvlJc w:val="left"/>
+      <w:pPr>
+        <w:ind w:left="2880" w:hanging="360"/>
+      </w:pPr>
+      <w:rPr>
+        <w:rFonts w:ascii="Symbol" w:hAnsi="Symbol" w:hint="default"/>
+      </w:rPr>
+    </w:lvl>
+    <w:lvl w:ilvl="4" w:tplc="04150003" w:tentative="1">
+      <w:start w:val="1"/>
+      <w:numFmt w:val="bullet"/>
+      <w:lvlText w:val="o"/>
+      <w:lvlJc w:val="left"/>
+      <w:pPr>
+        <w:ind w:left="3600" w:hanging="360"/>
+      </w:pPr>
+      <w:rPr>
+        <w:rFonts w:ascii="Courier New" w:hAnsi="Courier New" w:cs="Courier New" w:hint="default"/>
+      </w:rPr>
+    </w:lvl>
+    <w:lvl w:ilvl="5" w:tplc="04150005" w:tentative="1">
+      <w:start w:val="1"/>
+      <w:numFmt w:val="bullet"/>
+      <w:lvlText w:val=""/>
+      <w:lvlJc w:val="left"/>
+      <w:pPr>
+        <w:ind w:left="4320" w:hanging="360"/>
+      </w:pPr>
+      <w:rPr>
+        <w:rFonts w:ascii="Wingdings" w:hAnsi="Wingdings" w:hint="default"/>
+      </w:rPr>
+    </w:lvl>
+    <w:lvl w:ilvl="6" w:tplc="04150001" w:tentative="1">
+      <w:start w:val="1"/>
+      <w:numFmt w:val="bullet"/>
+      <w:lvlText w:val=""/>
+      <w:lvlJc w:val="left"/>
+      <w:pPr>
+        <w:ind w:left="5040" w:hanging="360"/>
+      </w:pPr>
+      <w:rPr>
+        <w:rFonts w:ascii="Symbol" w:hAnsi="Symbol" w:hint="default"/>
+      </w:rPr>
+    </w:lvl>
+    <w:lvl w:ilvl="7" w:tplc="04150003" w:tentative="1">
+      <w:start w:val="1"/>
+      <w:numFmt w:val="bullet"/>
+      <w:lvlText w:val="o"/>
+      <w:lvlJc w:val="left"/>
+      <w:pPr>
+        <w:ind w:left="5760" w:hanging="360"/>
+      </w:pPr>
+      <w:rPr>
+        <w:rFonts w:ascii="Courier New" w:hAnsi="Courier New" w:cs="Courier New" w:hint="default"/>
+      </w:rPr>
+    </w:lvl>
+    <w:lvl w:ilvl="8" w:tplc="04150005" w:tentative="1">
+      <w:start w:val="1"/>
+      <w:numFmt w:val="bullet"/>
+      <w:lvlText w:val=""/>
+      <w:lvlJc w:val="left"/>
+      <w:pPr>
+        <w:ind w:left="6480" w:hanging="360"/>
+      </w:pPr>
+      <w:rPr>
+        <w:rFonts w:ascii="Wingdings" w:hAnsi="Wingdings" w:hint="default"/>
+      </w:rPr>
+    </w:lvl>
+  </w:abstractNum>
+  <w:abstractNum w:abstractNumId="5" w15:restartNumberingAfterBreak="0">
     <w:nsid w:val="399717A5"/>
     <w:multiLevelType w:val="hybridMultilevel"/>
     <w:tmpl w:val="84C2ACF6"/>
@@ -1812,7 +2908,7 @@
       </w:rPr>
     </w:lvl>
   </w:abstractNum>
-  <w:abstractNum w:abstractNumId="5" w15:restartNumberingAfterBreak="0">
+  <w:abstractNum w:abstractNumId="6" w15:restartNumberingAfterBreak="0">
     <w:nsid w:val="472D3C70"/>
     <w:multiLevelType w:val="hybridMultilevel"/>
     <w:tmpl w:val="B1360DB6"/>
@@ -1925,7 +3021,7 @@
       </w:rPr>
     </w:lvl>
   </w:abstractNum>
-  <w:abstractNum w:abstractNumId="6" w15:restartNumberingAfterBreak="0">
+  <w:abstractNum w:abstractNumId="7" w15:restartNumberingAfterBreak="0">
     <w:nsid w:val="48B35213"/>
     <w:multiLevelType w:val="multilevel"/>
     <w:tmpl w:val="B32ACFE8"/>
@@ -2074,7 +3170,7 @@
       </w:rPr>
     </w:lvl>
   </w:abstractNum>
-  <w:abstractNum w:abstractNumId="7" w15:restartNumberingAfterBreak="0">
+  <w:abstractNum w:abstractNumId="8" w15:restartNumberingAfterBreak="0">
     <w:nsid w:val="4D5B61EE"/>
     <w:multiLevelType w:val="hybridMultilevel"/>
     <w:tmpl w:val="9320A148"/>
@@ -2163,7 +3259,7 @@
       </w:pPr>
     </w:lvl>
   </w:abstractNum>
-  <w:abstractNum w:abstractNumId="8" w15:restartNumberingAfterBreak="0">
+  <w:abstractNum w:abstractNumId="9" w15:restartNumberingAfterBreak="0">
     <w:nsid w:val="54C7211C"/>
     <w:multiLevelType w:val="multilevel"/>
     <w:tmpl w:val="D2CA2E2C"/>
@@ -2312,14 +3408,127 @@
       </w:rPr>
     </w:lvl>
   </w:abstractNum>
+  <w:abstractNum w:abstractNumId="10" w15:restartNumberingAfterBreak="0">
+    <w:nsid w:val="5F4D5C87"/>
+    <w:multiLevelType w:val="hybridMultilevel"/>
+    <w:tmpl w:val="F7B2EC9C"/>
+    <w:lvl w:ilvl="0" w:tplc="04150001">
+      <w:start w:val="1"/>
+      <w:numFmt w:val="bullet"/>
+      <w:lvlText w:val=""/>
+      <w:lvlJc w:val="left"/>
+      <w:pPr>
+        <w:ind w:left="720" w:hanging="360"/>
+      </w:pPr>
+      <w:rPr>
+        <w:rFonts w:ascii="Symbol" w:hAnsi="Symbol" w:hint="default"/>
+      </w:rPr>
+    </w:lvl>
+    <w:lvl w:ilvl="1" w:tplc="04150003" w:tentative="1">
+      <w:start w:val="1"/>
+      <w:numFmt w:val="bullet"/>
+      <w:lvlText w:val="o"/>
+      <w:lvlJc w:val="left"/>
+      <w:pPr>
+        <w:ind w:left="1440" w:hanging="360"/>
+      </w:pPr>
+      <w:rPr>
+        <w:rFonts w:ascii="Courier New" w:hAnsi="Courier New" w:cs="Courier New" w:hint="default"/>
+      </w:rPr>
+    </w:lvl>
+    <w:lvl w:ilvl="2" w:tplc="04150005" w:tentative="1">
+      <w:start w:val="1"/>
+      <w:numFmt w:val="bullet"/>
+      <w:lvlText w:val=""/>
+      <w:lvlJc w:val="left"/>
+      <w:pPr>
+        <w:ind w:left="2160" w:hanging="360"/>
+      </w:pPr>
+      <w:rPr>
+        <w:rFonts w:ascii="Wingdings" w:hAnsi="Wingdings" w:hint="default"/>
+      </w:rPr>
+    </w:lvl>
+    <w:lvl w:ilvl="3" w:tplc="04150001" w:tentative="1">
+      <w:start w:val="1"/>
+      <w:numFmt w:val="bullet"/>
+      <w:lvlText w:val=""/>
+      <w:lvlJc w:val="left"/>
+      <w:pPr>
+        <w:ind w:left="2880" w:hanging="360"/>
+      </w:pPr>
+      <w:rPr>
+        <w:rFonts w:ascii="Symbol" w:hAnsi="Symbol" w:hint="default"/>
+      </w:rPr>
+    </w:lvl>
+    <w:lvl w:ilvl="4" w:tplc="04150003" w:tentative="1">
+      <w:start w:val="1"/>
+      <w:numFmt w:val="bullet"/>
+      <w:lvlText w:val="o"/>
+      <w:lvlJc w:val="left"/>
+      <w:pPr>
+        <w:ind w:left="3600" w:hanging="360"/>
+      </w:pPr>
+      <w:rPr>
+        <w:rFonts w:ascii="Courier New" w:hAnsi="Courier New" w:cs="Courier New" w:hint="default"/>
+      </w:rPr>
+    </w:lvl>
+    <w:lvl w:ilvl="5" w:tplc="04150005" w:tentative="1">
+      <w:start w:val="1"/>
+      <w:numFmt w:val="bullet"/>
+      <w:lvlText w:val=""/>
+      <w:lvlJc w:val="left"/>
+      <w:pPr>
+        <w:ind w:left="4320" w:hanging="360"/>
+      </w:pPr>
+      <w:rPr>
+        <w:rFonts w:ascii="Wingdings" w:hAnsi="Wingdings" w:hint="default"/>
+      </w:rPr>
+    </w:lvl>
+    <w:lvl w:ilvl="6" w:tplc="04150001" w:tentative="1">
+      <w:start w:val="1"/>
+      <w:numFmt w:val="bullet"/>
+      <w:lvlText w:val=""/>
+      <w:lvlJc w:val="left"/>
+      <w:pPr>
+        <w:ind w:left="5040" w:hanging="360"/>
+      </w:pPr>
+      <w:rPr>
+        <w:rFonts w:ascii="Symbol" w:hAnsi="Symbol" w:hint="default"/>
+      </w:rPr>
+    </w:lvl>
+    <w:lvl w:ilvl="7" w:tplc="04150003" w:tentative="1">
+      <w:start w:val="1"/>
+      <w:numFmt w:val="bullet"/>
+      <w:lvlText w:val="o"/>
+      <w:lvlJc w:val="left"/>
+      <w:pPr>
+        <w:ind w:left="5760" w:hanging="360"/>
+      </w:pPr>
+      <w:rPr>
+        <w:rFonts w:ascii="Courier New" w:hAnsi="Courier New" w:cs="Courier New" w:hint="default"/>
+      </w:rPr>
+    </w:lvl>
+    <w:lvl w:ilvl="8" w:tplc="04150005" w:tentative="1">
+      <w:start w:val="1"/>
+      <w:numFmt w:val="bullet"/>
+      <w:lvlText w:val=""/>
+      <w:lvlJc w:val="left"/>
+      <w:pPr>
+        <w:ind w:left="6480" w:hanging="360"/>
+      </w:pPr>
+      <w:rPr>
+        <w:rFonts w:ascii="Wingdings" w:hAnsi="Wingdings" w:hint="default"/>
+      </w:rPr>
+    </w:lvl>
+  </w:abstractNum>
   <w:num w:numId="1" w16cid:durableId="1209873041">
-    <w:abstractNumId w:val="6"/>
+    <w:abstractNumId w:val="7"/>
   </w:num>
   <w:num w:numId="2" w16cid:durableId="1524709584">
     <w:abstractNumId w:val="3"/>
   </w:num>
   <w:num w:numId="3" w16cid:durableId="1471678760">
-    <w:abstractNumId w:val="8"/>
+    <w:abstractNumId w:val="9"/>
   </w:num>
   <w:num w:numId="4" w16cid:durableId="797532479">
     <w:abstractNumId w:val="0"/>
@@ -2328,15 +3537,21 @@
     <w:abstractNumId w:val="2"/>
   </w:num>
   <w:num w:numId="6" w16cid:durableId="1900247276">
-    <w:abstractNumId w:val="7"/>
+    <w:abstractNumId w:val="8"/>
   </w:num>
   <w:num w:numId="7" w16cid:durableId="1464806332">
     <w:abstractNumId w:val="1"/>
   </w:num>
   <w:num w:numId="8" w16cid:durableId="1067608836">
+    <w:abstractNumId w:val="6"/>
+  </w:num>
+  <w:num w:numId="9" w16cid:durableId="1667131356">
     <w:abstractNumId w:val="5"/>
   </w:num>
-  <w:num w:numId="9" w16cid:durableId="1667131356">
+  <w:num w:numId="10" w16cid:durableId="275985403">
+    <w:abstractNumId w:val="10"/>
+  </w:num>
+  <w:num w:numId="11" w16cid:durableId="656768486">
     <w:abstractNumId w:val="4"/>
   </w:num>
 </w:numbering>

</xml_diff>